<commit_message>
Add SharePoint deployment scripts and finalize logo/template updates
Adds the PnP.PowerShell-based tooling for deploying the Brand Center site
(interactive wizard, org template library registration, brand asset
library push, docx→dotx template conversion) plus its README. Also
updates index.html (remove legacy lockup section, swap in the current
no-ring multicolor mark), the M365 email signature template, and the
office-template docx files with the corrected embedded logo renders.

Co-Authored-By: Claude Sonnet 5 <noreply@anthropic.com>
</commit_message>
<xml_diff>
--- a/office-templates/Error404-Word-Template-Corporate-BW.docx
+++ b/office-templates/Error404-Word-Template-Corporate-BW.docx
@@ -1,6 +1,6 @@
 
 <file path=word/document.xml><?xml version="1.0" encoding="utf-8"?>
-<w:document xmlns:wpc="http://schemas.microsoft.com/office/word/2010/wordprocessingCanvas" xmlns:mc="http://schemas.openxmlformats.org/markup-compatibility/2006" xmlns:o="urn:schemas-microsoft-com:office:office" xmlns:r="http://schemas.openxmlformats.org/officeDocument/2006/relationships" xmlns:m="http://schemas.openxmlformats.org/officeDocument/2006/math" xmlns:v="urn:schemas-microsoft-com:vml" xmlns:wp14="http://schemas.microsoft.com/office/word/2010/wordprocessingDrawing" xmlns:wp="http://schemas.openxmlformats.org/drawingml/2006/wordprocessingDrawing" xmlns:w10="urn:schemas-microsoft-com:office:word" xmlns:w="http://schemas.openxmlformats.org/wordprocessingml/2006/main" xmlns:w14="http://schemas.microsoft.com/office/word/2010/wordml" xmlns:w15="http://schemas.microsoft.com/office/word/2012/wordml" xmlns:wpg="http://schemas.microsoft.com/office/word/2010/wordprocessingGroup" xmlns:wpi="http://schemas.microsoft.com/office/word/2010/wordprocessingInk" xmlns:wne="http://schemas.microsoft.com/office/word/2006/wordml" xmlns:wps="http://schemas.microsoft.com/office/word/2010/wordprocessingShape" xmlns:cx="http://schemas.microsoft.com/office/drawing/2014/chartex" xmlns:cx1="http://schemas.microsoft.com/office/drawing/2015/9/8/chartex" xmlns:cx2="http://schemas.microsoft.com/office/drawing/2015/10/21/chartex" xmlns:cx3="http://schemas.microsoft.com/office/drawing/2016/5/9/chartex" xmlns:cx4="http://schemas.microsoft.com/office/drawing/2016/5/10/chartex" xmlns:cx5="http://schemas.microsoft.com/office/drawing/2016/5/11/chartex" xmlns:cx6="http://schemas.microsoft.com/office/drawing/2016/5/12/chartex" xmlns:cx7="http://schemas.microsoft.com/office/drawing/2016/5/13/chartex" xmlns:cx8="http://schemas.microsoft.com/office/drawing/2016/5/14/chartex" xmlns:aink="http://schemas.microsoft.com/office/drawing/2016/ink" xmlns:am3d="http://schemas.microsoft.com/office/drawing/2017/model3d" xmlns:w16cex="http://schemas.microsoft.com/office/word/2018/wordml/cex" xmlns:w16cid="http://schemas.microsoft.com/office/word/2016/wordml/cid" xmlns:w16="http://schemas.microsoft.com/office/word/2018/wordml" xmlns:w16sdtdh="http://schemas.microsoft.com/office/word/2020/wordml/sdtdatahash" xmlns:w16se="http://schemas.microsoft.com/office/word/2015/wordml/symex" mc:Ignorable="w14 w15 wp14">
+<w:document xmlns:wpc="http://schemas.microsoft.com/office/word/2010/wordprocessingCanvas" xmlns:cx="http://schemas.microsoft.com/office/drawing/2014/chartex" xmlns:cx1="http://schemas.microsoft.com/office/drawing/2015/9/8/chartex" xmlns:cx2="http://schemas.microsoft.com/office/drawing/2015/10/21/chartex" xmlns:cx3="http://schemas.microsoft.com/office/drawing/2016/5/9/chartex" xmlns:cx4="http://schemas.microsoft.com/office/drawing/2016/5/10/chartex" xmlns:cx5="http://schemas.microsoft.com/office/drawing/2016/5/11/chartex" xmlns:cx6="http://schemas.microsoft.com/office/drawing/2016/5/12/chartex" xmlns:cx7="http://schemas.microsoft.com/office/drawing/2016/5/13/chartex" xmlns:cx8="http://schemas.microsoft.com/office/drawing/2016/5/14/chartex" xmlns:mc="http://schemas.openxmlformats.org/markup-compatibility/2006" xmlns:m="http://schemas.openxmlformats.org/officeDocument/2006/math" xmlns:aink="http://schemas.microsoft.com/office/drawing/2016/ink" xmlns:am3d="http://schemas.microsoft.com/office/drawing/2017/model3d" xmlns:oel="http://schemas.microsoft.com/office/2019/extlst" xmlns:r="http://schemas.openxmlformats.org/officeDocument/2006/relationships" xmlns:wp14="http://schemas.microsoft.com/office/word/2010/wordprocessingDrawing" xmlns:wp="http://schemas.openxmlformats.org/drawingml/2006/wordprocessingDrawing" xmlns:wpg="http://schemas.microsoft.com/office/word/2010/wordprocessingGroup" xmlns:wpi="http://schemas.microsoft.com/office/word/2010/wordprocessingInk" xmlns:wps="http://schemas.microsoft.com/office/word/2010/wordprocessingShape" xmlns:o="urn:schemas-microsoft-com:office:office" xmlns:v="urn:schemas-microsoft-com:vml" xmlns:w10="urn:schemas-microsoft-com:office:word" xmlns:w="http://schemas.openxmlformats.org/wordprocessingml/2006/main" xmlns:w14="http://schemas.microsoft.com/office/word/2010/wordml" xmlns:w15="http://schemas.microsoft.com/office/word/2012/wordml" xmlns:w16cex="http://schemas.microsoft.com/office/word/2018/wordml/cex" xmlns:w16cid="http://schemas.microsoft.com/office/word/2016/wordml/cid" xmlns:w16="http://schemas.microsoft.com/office/word/2018/wordml" xmlns:w16sdtdh="http://schemas.microsoft.com/office/word/2020/wordml/sdtdatahash" xmlns:w16sdtfl="http://schemas.microsoft.com/office/word/2024/wordml/sdtformatlock" xmlns:w16se="http://schemas.microsoft.com/office/word/2015/wordml/symex" xmlns:w16du="http://schemas.microsoft.com/office/word/2023/wordml/word16du" xmlns:wne="http://schemas.microsoft.com/office/word/2006/wordml" mc:Ignorable="w14 w15 w16se w16cid w16 w16cex w16sdtdh w16sdtfl w16du wp14">
   <w:body>
     <w:p>
       <w:pPr>
@@ -12,11 +12,14 @@
         <w:jc w:val="center"/>
       </w:pPr>
       <w:r>
+        <w:rPr>
+          <w:noProof/>
+        </w:rPr>
         <w:drawing>
-          <wp:inline distT="0" distB="0" distL="0" distR="0">
+          <wp:inline distT="0" distB="0" distL="0" distR="0" wp14:anchorId="7DA50CEF" wp14:editId="3FEE22B0">
             <wp:extent cx="1047750" cy="1047750"/>
-            <wp:effectExtent t="0" r="0" b="0" l="0"/>
-            <wp:docPr id="1" name="" descr="" title=""/>
+            <wp:effectExtent l="0" t="0" r="0" b="0"/>
+            <wp:docPr id="1" name="Picture 1"/>
             <wp:cNvGraphicFramePr>
               <a:graphicFrameLocks xmlns:a="http://schemas.openxmlformats.org/drawingml/2006/main" noChangeAspect="1"/>
             </wp:cNvGraphicFramePr>
@@ -24,13 +27,13 @@
               <a:graphicData uri="http://schemas.openxmlformats.org/drawingml/2006/picture">
                 <pic:pic xmlns:pic="http://schemas.openxmlformats.org/drawingml/2006/picture">
                   <pic:nvPicPr>
-                    <pic:cNvPr id="0" name="" descr=""/>
+                    <pic:cNvPr id="0" name=""/>
                     <pic:cNvPicPr>
                       <a:picLocks noChangeAspect="1" noChangeArrowheads="1"/>
                     </pic:cNvPicPr>
                   </pic:nvPicPr>
                   <pic:blipFill>
-                    <a:blip r:embed="rId9" cstate="none"/>
+                    <a:blip r:embed="rId7"/>
                     <a:srcRect/>
                     <a:stretch>
                       <a:fillRect/>
@@ -59,27 +62,26 @@
       </w:pPr>
       <w:r>
         <w:rPr>
-          <w:rFonts w:ascii="Courier New" w:cs="Courier New" w:eastAsia="Courier New" w:hAnsi="Courier New"/>
           <w:b/>
           <w:bCs/>
           <w:sz w:val="32"/>
           <w:szCs w:val="32"/>
         </w:rPr>
-        <w:t xml:space="preserve">ERROR404.NET</w:t>
+        <w:t>ERROR404.NET</w:t>
       </w:r>
     </w:p>
     <w:p>
       <w:pPr>
         <w:spacing w:after="120"/>
+        <w:jc w:val="center"/>
       </w:pPr>
       <w:r>
         <w:rPr>
-          <w:rFonts w:ascii="Courier New" w:cs="Courier New" w:eastAsia="Courier New" w:hAnsi="Courier New"/>
           <w:color w:val="555555"/>
           <w:sz w:val="16"/>
           <w:szCs w:val="16"/>
         </w:rPr>
-        <w:t xml:space="preserve">======================================================================</w:t>
+        <w:t>======================================================================</w:t>
       </w:r>
     </w:p>
     <w:p>
@@ -87,8 +89,13 @@
         <w:pStyle w:val="Title"/>
       </w:pPr>
       <w:r>
-        <w:t xml:space="preserve">[ DOCUMENT TITLE ]</w:t>
-      </w:r>
+        <w:t xml:space="preserve">[ DOCUMENT </w:t>
+      </w:r>
+      <w:proofErr w:type="gramStart"/>
+      <w:r>
+        <w:t>TITLE ]</w:t>
+      </w:r>
+      <w:proofErr w:type="gramEnd"/>
     </w:p>
     <w:p>
       <w:pPr>
@@ -97,14 +104,11 @@
       </w:pPr>
       <w:r>
         <w:rPr>
-          <w:rFonts w:ascii="Courier New" w:cs="Courier New" w:eastAsia="Courier New" w:hAnsi="Courier New"/>
           <w:i/>
           <w:iCs/>
           <w:color w:val="555555"/>
-          <w:sz w:val="22"/>
-          <w:szCs w:val="22"/>
         </w:rPr>
-        <w:t xml:space="preserve">Subtitle or one-line description goes here</w:t>
+        <w:t>Subtitle or one-line description goes here</w:t>
       </w:r>
     </w:p>
     <w:p>
@@ -113,11 +117,10 @@
       </w:pPr>
       <w:r>
         <w:rPr>
-          <w:rFonts w:ascii="Courier New" w:cs="Courier New" w:eastAsia="Courier New" w:hAnsi="Courier New"/>
           <w:sz w:val="20"/>
           <w:szCs w:val="20"/>
         </w:rPr>
-        <w:t xml:space="preserve">Prepared for:  &lt;Client / Recipient&gt;</w:t>
+        <w:t>Prepared for:  &lt;Client / Recipient&gt;</w:t>
       </w:r>
     </w:p>
     <w:p>
@@ -127,11 +130,10 @@
       </w:pPr>
       <w:r>
         <w:rPr>
-          <w:rFonts w:ascii="Courier New" w:cs="Courier New" w:eastAsia="Courier New" w:hAnsi="Courier New"/>
           <w:sz w:val="20"/>
           <w:szCs w:val="20"/>
         </w:rPr>
-        <w:t xml:space="preserve">Date:  &lt;Month DD, YYYY&gt;</w:t>
+        <w:t>Date:  &lt;Month DD, YYYY&gt;</w:t>
       </w:r>
     </w:p>
     <w:p>
@@ -140,15 +142,17 @@
       </w:pPr>
       <w:r>
         <w:rPr>
-          <w:rFonts w:ascii="Courier New" w:cs="Courier New" w:eastAsia="Courier New" w:hAnsi="Courier New"/>
           <w:color w:val="555555"/>
           <w:sz w:val="18"/>
           <w:szCs w:val="18"/>
         </w:rPr>
-        <w:t xml:space="preserve">error404.net</w:t>
-      </w:r>
-    </w:p>
-    <w:p>
+        <w:t>error404.net</w:t>
+      </w:r>
+    </w:p>
+    <w:p>
+      <w:pPr>
+        <w:jc w:val="center"/>
+      </w:pPr>
       <w:r>
         <w:br w:type="page"/>
       </w:r>
@@ -158,12 +162,13 @@
         <w:pStyle w:val="Heading1"/>
       </w:pPr>
       <w:r>
-        <w:t xml:space="preserve">Section One — Overview</w:t>
-      </w:r>
-    </w:p>
-    <w:p>
-      <w:r>
-        <w:t xml:space="preserve">This is the body text style — Courier New at 11pt, black on white, no color, no glow, no gradients, per the locked Print/Corporate treatment mode. Use this style for all paragraph text in formal, client-facing, or printed documents.</w:t>
+        <w:lastRenderedPageBreak/>
+        <w:t>Section One — Overview</w:t>
+      </w:r>
+    </w:p>
+    <w:p>
+      <w:r>
+        <w:t>This is the body text style — Courier New at 11pt, black on white, no color, no glow, no gradients, per the locked Print/Corporate treatment mode. Use this style for all paragraph text in formal, client-facing, or printed documents.</w:t>
       </w:r>
     </w:p>
     <w:p>
@@ -171,12 +176,12 @@
         <w:pStyle w:val="Heading2"/>
       </w:pPr>
       <w:r>
-        <w:t xml:space="preserve">A subsection heading</w:t>
-      </w:r>
-    </w:p>
-    <w:p>
-      <w:r>
-        <w:t xml:space="preserve">Body copy continues here. The rule of thumb: if it's going to be printed, exported to Word/PDF, or read in someone else's inbox, stay in this monochrome mode — the full-color digital treatment is reserved for screens you control.</w:t>
+        <w:t>A subsection heading</w:t>
+      </w:r>
+    </w:p>
+    <w:p>
+      <w:r>
+        <w:t>Body copy continues here. The rule of thumb: if it's going to be printed, exported to Word/PDF, or read in someone else's inbox, stay in this monochrome mode — the full-color digital treatment is reserved for screens you control.</w:t>
       </w:r>
     </w:p>
     <w:p>
@@ -184,12 +189,12 @@
         <w:pStyle w:val="Heading3"/>
       </w:pPr>
       <w:r>
-        <w:t xml:space="preserve">A minor heading</w:t>
-      </w:r>
-    </w:p>
-    <w:p>
-      <w:r>
-        <w:t xml:space="preserve">Bullet list:</w:t>
+        <w:t>A minor heading</w:t>
+      </w:r>
+    </w:p>
+    <w:p>
+      <w:r>
+        <w:t>Bullet list:</w:t>
       </w:r>
     </w:p>
     <w:p>
@@ -201,7 +206,7 @@
         </w:numPr>
       </w:pPr>
       <w:r>
-        <w:t xml:space="preserve">First point.</w:t>
+        <w:t>First point.</w:t>
       </w:r>
     </w:p>
     <w:p>
@@ -213,7 +218,7 @@
         </w:numPr>
       </w:pPr>
       <w:r>
-        <w:t xml:space="preserve">Second point.</w:t>
+        <w:t>Second point.</w:t>
       </w:r>
     </w:p>
     <w:p>
@@ -225,7 +230,7 @@
         </w:numPr>
       </w:pPr>
       <w:r>
-        <w:t xml:space="preserve">Third point.</w:t>
+        <w:t>Third point.</w:t>
       </w:r>
     </w:p>
     <w:p>
@@ -233,7 +238,7 @@
         <w:spacing w:before="200"/>
       </w:pPr>
       <w:r>
-        <w:t xml:space="preserve">Numbered list:</w:t>
+        <w:t>Numbered list:</w:t>
       </w:r>
     </w:p>
     <w:p>
@@ -245,7 +250,7 @@
         </w:numPr>
       </w:pPr>
       <w:r>
-        <w:t xml:space="preserve">Step one.</w:t>
+        <w:t>Step one.</w:t>
       </w:r>
     </w:p>
     <w:p>
@@ -257,7 +262,7 @@
         </w:numPr>
       </w:pPr>
       <w:r>
-        <w:t xml:space="preserve">Step two.</w:t>
+        <w:t>Step two.</w:t>
       </w:r>
     </w:p>
     <w:p>
@@ -269,7 +274,7 @@
         </w:numPr>
       </w:pPr>
       <w:r>
-        <w:t xml:space="preserve">Step three.</w:t>
+        <w:t>Step three.</w:t>
       </w:r>
     </w:p>
     <w:p>
@@ -277,33 +282,44 @@
         <w:pStyle w:val="Heading2"/>
       </w:pPr>
       <w:r>
-        <w:t xml:space="preserve">Callout / note box</w:t>
+        <w:t>Callout / note box</w:t>
       </w:r>
     </w:p>
     <w:tbl>
       <w:tblPr>
-        <w:tblW w:type="pct" w:w="100%"/>
+        <w:tblW w:w="5000" w:type="pct"/>
         <w:tblBorders>
-          <w:top w:val="single" w:color="000000" w:sz="6"/>
-          <w:left w:val="single" w:color="000000" w:sz="6"/>
-          <w:bottom w:val="single" w:color="000000" w:sz="6"/>
-          <w:right w:val="single" w:color="000000" w:sz="6"/>
-          <w:insideH w:val="single" w:color="auto" w:sz="4"/>
-          <w:insideV w:val="single" w:color="auto" w:sz="4"/>
+          <w:top w:val="single" w:sz="6" w:space="0" w:color="000000"/>
+          <w:left w:val="single" w:sz="6" w:space="0" w:color="000000"/>
+          <w:bottom w:val="single" w:sz="6" w:space="0" w:color="000000"/>
+          <w:right w:val="single" w:sz="6" w:space="0" w:color="000000"/>
+          <w:insideH w:val="single" w:sz="4" w:space="0" w:color="auto"/>
+          <w:insideV w:val="single" w:sz="4" w:space="0" w:color="auto"/>
         </w:tblBorders>
+        <w:tblCellMar>
+          <w:left w:w="10" w:type="dxa"/>
+          <w:right w:w="10" w:type="dxa"/>
+        </w:tblCellMar>
+        <w:tblLook w:val="0000" w:firstRow="0" w:lastRow="0" w:firstColumn="0" w:lastColumn="0" w:noHBand="0" w:noVBand="0"/>
       </w:tblPr>
       <w:tblGrid>
-        <w:gridCol w:w="100"/>
+        <w:gridCol w:w="9344"/>
       </w:tblGrid>
       <w:tr>
+        <w:tblPrEx>
+          <w:tblCellMar>
+            <w:top w:w="0" w:type="dxa"/>
+            <w:bottom w:w="0" w:type="dxa"/>
+          </w:tblCellMar>
+        </w:tblPrEx>
         <w:tc>
           <w:tcPr>
-            <w:tcW w:type="pct" w:w="100%"/>
+            <w:tcW w:w="5000" w:type="pct"/>
             <w:tcMar>
-              <w:top w:type="dxa" w:w="100"/>
-              <w:left w:type="dxa" w:w="200"/>
-              <w:bottom w:type="dxa" w:w="100"/>
-              <w:right w:type="dxa" w:w="200"/>
+              <w:top w:w="100" w:type="dxa"/>
+              <w:left w:w="200" w:type="dxa"/>
+              <w:bottom w:w="100" w:type="dxa"/>
+              <w:right w:w="200" w:type="dxa"/>
             </w:tcMar>
           </w:tcPr>
           <w:p>
@@ -312,13 +328,12 @@
             </w:pPr>
             <w:r>
               <w:rPr>
-                <w:rFonts w:ascii="Courier New" w:cs="Courier New" w:eastAsia="Courier New" w:hAnsi="Courier New"/>
                 <w:b/>
                 <w:bCs/>
                 <w:sz w:val="20"/>
                 <w:szCs w:val="20"/>
               </w:rPr>
-              <w:t xml:space="preserve">NOTE:</w:t>
+              <w:t>NOTE:</w:t>
             </w:r>
           </w:p>
           <w:p>
@@ -327,13 +342,10 @@
             </w:pPr>
             <w:r>
               <w:rPr>
-                <w:rFonts w:ascii="Courier New" w:cs="Courier New" w:eastAsia="Courier New" w:hAnsi="Courier New"/>
-                <w:b w:val="false"/>
-                <w:bCs w:val="false"/>
                 <w:sz w:val="20"/>
                 <w:szCs w:val="20"/>
               </w:rPr>
-              <w:t xml:space="preserve">Use a bordered box like this one for callouts, warnings, or pull-quotes — the ASCII-rule/boxed-field aesthetic is what carries the brand's "hacker" identity here instead of color.</w:t>
+              <w:t>Use a bordered box like this one for callouts, warnings, or pull-quotes — the ASCII-rule/boxed-field aesthetic is what carries the brand's "hacker" identity here instead of color.</w:t>
             </w:r>
           </w:p>
         </w:tc>
@@ -345,20 +357,25 @@
         <w:spacing w:before="160"/>
       </w:pPr>
       <w:r>
-        <w:t xml:space="preserve">Table style</w:t>
+        <w:t>Table style</w:t>
       </w:r>
     </w:p>
     <w:tbl>
       <w:tblPr>
-        <w:tblW w:type="dxa" w:w="9360"/>
+        <w:tblW w:w="9360" w:type="dxa"/>
         <w:tblBorders>
-          <w:top w:val="single" w:color="auto" w:sz="4"/>
-          <w:left w:val="single" w:color="auto" w:sz="4"/>
-          <w:bottom w:val="single" w:color="auto" w:sz="4"/>
-          <w:right w:val="single" w:color="auto" w:sz="4"/>
-          <w:insideH w:val="single" w:color="auto" w:sz="4"/>
-          <w:insideV w:val="single" w:color="auto" w:sz="4"/>
+          <w:top w:val="single" w:sz="4" w:space="0" w:color="auto"/>
+          <w:left w:val="single" w:sz="4" w:space="0" w:color="auto"/>
+          <w:bottom w:val="single" w:sz="4" w:space="0" w:color="auto"/>
+          <w:right w:val="single" w:sz="4" w:space="0" w:color="auto"/>
+          <w:insideH w:val="single" w:sz="4" w:space="0" w:color="auto"/>
+          <w:insideV w:val="single" w:sz="4" w:space="0" w:color="auto"/>
         </w:tblBorders>
+        <w:tblCellMar>
+          <w:left w:w="10" w:type="dxa"/>
+          <w:right w:w="10" w:type="dxa"/>
+        </w:tblCellMar>
+        <w:tblLook w:val="0000" w:firstRow="0" w:lastRow="0" w:firstColumn="0" w:lastColumn="0" w:noHBand="0" w:noVBand="0"/>
       </w:tblPr>
       <w:tblGrid>
         <w:gridCol w:w="3120"/>
@@ -366,290 +383,290 @@
         <w:gridCol w:w="3120"/>
       </w:tblGrid>
       <w:tr>
+        <w:tblPrEx>
+          <w:tblCellMar>
+            <w:top w:w="0" w:type="dxa"/>
+            <w:bottom w:w="0" w:type="dxa"/>
+          </w:tblCellMar>
+        </w:tblPrEx>
         <w:trPr>
           <w:tblHeader/>
         </w:trPr>
         <w:tc>
           <w:tcPr>
-            <w:tcW w:type="dxa" w:w="3120"/>
-            <w:shd w:fill="000000" w:val="clear"/>
+            <w:tcW w:w="3120" w:type="dxa"/>
+            <w:shd w:val="clear" w:color="auto" w:fill="000000"/>
             <w:tcMar>
-              <w:top w:type="dxa" w:w="80"/>
-              <w:left w:type="dxa" w:w="100"/>
-              <w:bottom w:type="dxa" w:w="80"/>
-              <w:right w:type="dxa" w:w="100"/>
+              <w:top w:w="80" w:type="dxa"/>
+              <w:left w:w="100" w:type="dxa"/>
+              <w:bottom w:w="80" w:type="dxa"/>
+              <w:right w:w="100" w:type="dxa"/>
             </w:tcMar>
             <w:vAlign w:val="center"/>
           </w:tcPr>
           <w:p>
             <w:r>
               <w:rPr>
-                <w:rFonts w:ascii="Courier New" w:cs="Courier New" w:eastAsia="Courier New" w:hAnsi="Courier New"/>
                 <w:b/>
                 <w:bCs/>
                 <w:color w:val="FFFFFF"/>
                 <w:sz w:val="20"/>
                 <w:szCs w:val="20"/>
               </w:rPr>
-              <w:t xml:space="preserve">Item</w:t>
+              <w:t>Item</w:t>
             </w:r>
           </w:p>
         </w:tc>
         <w:tc>
           <w:tcPr>
-            <w:tcW w:type="dxa" w:w="3120"/>
-            <w:shd w:fill="000000" w:val="clear"/>
+            <w:tcW w:w="3120" w:type="dxa"/>
+            <w:shd w:val="clear" w:color="auto" w:fill="000000"/>
             <w:tcMar>
-              <w:top w:type="dxa" w:w="80"/>
-              <w:left w:type="dxa" w:w="100"/>
-              <w:bottom w:type="dxa" w:w="80"/>
-              <w:right w:type="dxa" w:w="100"/>
+              <w:top w:w="80" w:type="dxa"/>
+              <w:left w:w="100" w:type="dxa"/>
+              <w:bottom w:w="80" w:type="dxa"/>
+              <w:right w:w="100" w:type="dxa"/>
             </w:tcMar>
             <w:vAlign w:val="center"/>
           </w:tcPr>
           <w:p>
             <w:r>
               <w:rPr>
-                <w:rFonts w:ascii="Courier New" w:cs="Courier New" w:eastAsia="Courier New" w:hAnsi="Courier New"/>
                 <w:b/>
                 <w:bCs/>
                 <w:color w:val="FFFFFF"/>
                 <w:sz w:val="20"/>
                 <w:szCs w:val="20"/>
               </w:rPr>
-              <w:t xml:space="preserve">Status</w:t>
+              <w:t>Status</w:t>
             </w:r>
           </w:p>
         </w:tc>
         <w:tc>
           <w:tcPr>
-            <w:tcW w:type="dxa" w:w="3120"/>
-            <w:shd w:fill="000000" w:val="clear"/>
+            <w:tcW w:w="3120" w:type="dxa"/>
+            <w:shd w:val="clear" w:color="auto" w:fill="000000"/>
             <w:tcMar>
-              <w:top w:type="dxa" w:w="80"/>
-              <w:left w:type="dxa" w:w="100"/>
-              <w:bottom w:type="dxa" w:w="80"/>
-              <w:right w:type="dxa" w:w="100"/>
+              <w:top w:w="80" w:type="dxa"/>
+              <w:left w:w="100" w:type="dxa"/>
+              <w:bottom w:w="80" w:type="dxa"/>
+              <w:right w:w="100" w:type="dxa"/>
             </w:tcMar>
             <w:vAlign w:val="center"/>
           </w:tcPr>
           <w:p>
             <w:r>
               <w:rPr>
-                <w:rFonts w:ascii="Courier New" w:cs="Courier New" w:eastAsia="Courier New" w:hAnsi="Courier New"/>
                 <w:b/>
                 <w:bCs/>
                 <w:color w:val="FFFFFF"/>
                 <w:sz w:val="20"/>
                 <w:szCs w:val="20"/>
               </w:rPr>
-              <w:t xml:space="preserve">Notes</w:t>
+              <w:t>Notes</w:t>
             </w:r>
           </w:p>
         </w:tc>
       </w:tr>
       <w:tr>
+        <w:tblPrEx>
+          <w:tblCellMar>
+            <w:top w:w="0" w:type="dxa"/>
+            <w:bottom w:w="0" w:type="dxa"/>
+          </w:tblCellMar>
+        </w:tblPrEx>
         <w:trPr>
           <w:cantSplit/>
         </w:trPr>
         <w:tc>
           <w:tcPr>
-            <w:tcW w:type="dxa" w:w="3120"/>
+            <w:tcW w:w="3120" w:type="dxa"/>
             <w:tcBorders>
-              <w:top w:val="single" w:color="000000" w:sz="2"/>
-              <w:left w:val="single" w:color="000000" w:sz="2"/>
-              <w:bottom w:val="single" w:color="000000" w:sz="2"/>
-              <w:right w:val="single" w:color="000000" w:sz="2"/>
+              <w:top w:val="single" w:sz="2" w:space="0" w:color="000000"/>
+              <w:left w:val="single" w:sz="2" w:space="0" w:color="000000"/>
+              <w:bottom w:val="single" w:sz="2" w:space="0" w:color="000000"/>
+              <w:right w:val="single" w:sz="2" w:space="0" w:color="000000"/>
             </w:tcBorders>
             <w:tcMar>
-              <w:top w:type="dxa" w:w="80"/>
-              <w:left w:type="dxa" w:w="100"/>
-              <w:bottom w:type="dxa" w:w="80"/>
-              <w:right w:type="dxa" w:w="100"/>
+              <w:top w:w="80" w:type="dxa"/>
+              <w:left w:w="100" w:type="dxa"/>
+              <w:bottom w:w="80" w:type="dxa"/>
+              <w:right w:w="100" w:type="dxa"/>
             </w:tcMar>
           </w:tcPr>
           <w:p>
             <w:r>
               <w:rPr>
-                <w:rFonts w:ascii="Courier New" w:cs="Courier New" w:eastAsia="Courier New" w:hAnsi="Courier New"/>
                 <w:sz w:val="20"/>
                 <w:szCs w:val="20"/>
               </w:rPr>
-              <w:t xml:space="preserve">Example row</w:t>
+              <w:t>Example row</w:t>
             </w:r>
           </w:p>
         </w:tc>
         <w:tc>
           <w:tcPr>
-            <w:tcW w:type="dxa" w:w="3120"/>
+            <w:tcW w:w="3120" w:type="dxa"/>
             <w:tcBorders>
-              <w:top w:val="single" w:color="000000" w:sz="2"/>
-              <w:left w:val="single" w:color="000000" w:sz="2"/>
-              <w:bottom w:val="single" w:color="000000" w:sz="2"/>
-              <w:right w:val="single" w:color="000000" w:sz="2"/>
+              <w:top w:val="single" w:sz="2" w:space="0" w:color="000000"/>
+              <w:left w:val="single" w:sz="2" w:space="0" w:color="000000"/>
+              <w:bottom w:val="single" w:sz="2" w:space="0" w:color="000000"/>
+              <w:right w:val="single" w:sz="2" w:space="0" w:color="000000"/>
             </w:tcBorders>
             <w:tcMar>
-              <w:top w:type="dxa" w:w="80"/>
-              <w:left w:type="dxa" w:w="100"/>
-              <w:bottom w:type="dxa" w:w="80"/>
-              <w:right w:type="dxa" w:w="100"/>
+              <w:top w:w="80" w:type="dxa"/>
+              <w:left w:w="100" w:type="dxa"/>
+              <w:bottom w:w="80" w:type="dxa"/>
+              <w:right w:w="100" w:type="dxa"/>
             </w:tcMar>
           </w:tcPr>
           <w:p>
             <w:r>
               <w:rPr>
-                <w:rFonts w:ascii="Courier New" w:cs="Courier New" w:eastAsia="Courier New" w:hAnsi="Courier New"/>
                 <w:sz w:val="20"/>
                 <w:szCs w:val="20"/>
               </w:rPr>
-              <w:t xml:space="preserve">Done</w:t>
+              <w:t>Done</w:t>
             </w:r>
           </w:p>
         </w:tc>
         <w:tc>
           <w:tcPr>
-            <w:tcW w:type="dxa" w:w="3120"/>
+            <w:tcW w:w="3120" w:type="dxa"/>
             <w:tcBorders>
-              <w:top w:val="single" w:color="000000" w:sz="2"/>
-              <w:left w:val="single" w:color="000000" w:sz="2"/>
-              <w:bottom w:val="single" w:color="000000" w:sz="2"/>
-              <w:right w:val="single" w:color="000000" w:sz="2"/>
+              <w:top w:val="single" w:sz="2" w:space="0" w:color="000000"/>
+              <w:left w:val="single" w:sz="2" w:space="0" w:color="000000"/>
+              <w:bottom w:val="single" w:sz="2" w:space="0" w:color="000000"/>
+              <w:right w:val="single" w:sz="2" w:space="0" w:color="000000"/>
             </w:tcBorders>
             <w:tcMar>
-              <w:top w:type="dxa" w:w="80"/>
-              <w:left w:type="dxa" w:w="100"/>
-              <w:bottom w:type="dxa" w:w="80"/>
-              <w:right w:type="dxa" w:w="100"/>
+              <w:top w:w="80" w:type="dxa"/>
+              <w:left w:w="100" w:type="dxa"/>
+              <w:bottom w:w="80" w:type="dxa"/>
+              <w:right w:w="100" w:type="dxa"/>
             </w:tcMar>
           </w:tcPr>
           <w:p>
             <w:r>
               <w:rPr>
-                <w:rFonts w:ascii="Courier New" w:cs="Courier New" w:eastAsia="Courier New" w:hAnsi="Courier New"/>
                 <w:sz w:val="20"/>
                 <w:szCs w:val="20"/>
               </w:rPr>
-              <w:t xml:space="preserve">Sample content</w:t>
+              <w:t>Sample content</w:t>
             </w:r>
           </w:p>
         </w:tc>
       </w:tr>
       <w:tr>
+        <w:tblPrEx>
+          <w:tblCellMar>
+            <w:top w:w="0" w:type="dxa"/>
+            <w:bottom w:w="0" w:type="dxa"/>
+          </w:tblCellMar>
+        </w:tblPrEx>
         <w:trPr>
           <w:cantSplit/>
         </w:trPr>
         <w:tc>
           <w:tcPr>
-            <w:tcW w:type="dxa" w:w="3120"/>
+            <w:tcW w:w="3120" w:type="dxa"/>
             <w:tcBorders>
-              <w:top w:val="single" w:color="000000" w:sz="2"/>
-              <w:left w:val="single" w:color="000000" w:sz="2"/>
-              <w:bottom w:val="single" w:color="000000" w:sz="2"/>
-              <w:right w:val="single" w:color="000000" w:sz="2"/>
+              <w:top w:val="single" w:sz="2" w:space="0" w:color="000000"/>
+              <w:left w:val="single" w:sz="2" w:space="0" w:color="000000"/>
+              <w:bottom w:val="single" w:sz="2" w:space="0" w:color="000000"/>
+              <w:right w:val="single" w:sz="2" w:space="0" w:color="000000"/>
             </w:tcBorders>
             <w:tcMar>
-              <w:top w:type="dxa" w:w="80"/>
-              <w:left w:type="dxa" w:w="100"/>
-              <w:bottom w:type="dxa" w:w="80"/>
-              <w:right w:type="dxa" w:w="100"/>
+              <w:top w:w="80" w:type="dxa"/>
+              <w:left w:w="100" w:type="dxa"/>
+              <w:bottom w:w="80" w:type="dxa"/>
+              <w:right w:w="100" w:type="dxa"/>
             </w:tcMar>
           </w:tcPr>
           <w:p>
             <w:r>
               <w:rPr>
-                <w:rFonts w:ascii="Courier New" w:cs="Courier New" w:eastAsia="Courier New" w:hAnsi="Courier New"/>
                 <w:sz w:val="20"/>
                 <w:szCs w:val="20"/>
               </w:rPr>
-              <w:t xml:space="preserve">Another row</w:t>
+              <w:t>Another row</w:t>
             </w:r>
           </w:p>
         </w:tc>
         <w:tc>
           <w:tcPr>
-            <w:tcW w:type="dxa" w:w="3120"/>
+            <w:tcW w:w="3120" w:type="dxa"/>
             <w:tcBorders>
-              <w:top w:val="single" w:color="000000" w:sz="2"/>
-              <w:left w:val="single" w:color="000000" w:sz="2"/>
-              <w:bottom w:val="single" w:color="000000" w:sz="2"/>
-              <w:right w:val="single" w:color="000000" w:sz="2"/>
+              <w:top w:val="single" w:sz="2" w:space="0" w:color="000000"/>
+              <w:left w:val="single" w:sz="2" w:space="0" w:color="000000"/>
+              <w:bottom w:val="single" w:sz="2" w:space="0" w:color="000000"/>
+              <w:right w:val="single" w:sz="2" w:space="0" w:color="000000"/>
             </w:tcBorders>
             <w:tcMar>
-              <w:top w:type="dxa" w:w="80"/>
-              <w:left w:type="dxa" w:w="100"/>
-              <w:bottom w:type="dxa" w:w="80"/>
-              <w:right w:type="dxa" w:w="100"/>
+              <w:top w:w="80" w:type="dxa"/>
+              <w:left w:w="100" w:type="dxa"/>
+              <w:bottom w:w="80" w:type="dxa"/>
+              <w:right w:w="100" w:type="dxa"/>
             </w:tcMar>
           </w:tcPr>
           <w:p>
             <w:r>
               <w:rPr>
-                <w:rFonts w:ascii="Courier New" w:cs="Courier New" w:eastAsia="Courier New" w:hAnsi="Courier New"/>
                 <w:sz w:val="20"/>
                 <w:szCs w:val="20"/>
               </w:rPr>
-              <w:t xml:space="preserve">Pending</w:t>
+              <w:t>Pending</w:t>
             </w:r>
           </w:p>
         </w:tc>
         <w:tc>
           <w:tcPr>
-            <w:tcW w:type="dxa" w:w="3120"/>
+            <w:tcW w:w="3120" w:type="dxa"/>
             <w:tcBorders>
-              <w:top w:val="single" w:color="000000" w:sz="2"/>
-              <w:left w:val="single" w:color="000000" w:sz="2"/>
-              <w:bottom w:val="single" w:color="000000" w:sz="2"/>
-              <w:right w:val="single" w:color="000000" w:sz="2"/>
+              <w:top w:val="single" w:sz="2" w:space="0" w:color="000000"/>
+              <w:left w:val="single" w:sz="2" w:space="0" w:color="000000"/>
+              <w:bottom w:val="single" w:sz="2" w:space="0" w:color="000000"/>
+              <w:right w:val="single" w:sz="2" w:space="0" w:color="000000"/>
             </w:tcBorders>
             <w:tcMar>
-              <w:top w:type="dxa" w:w="80"/>
-              <w:left w:type="dxa" w:w="100"/>
-              <w:bottom w:type="dxa" w:w="80"/>
-              <w:right w:type="dxa" w:w="100"/>
+              <w:top w:w="80" w:type="dxa"/>
+              <w:left w:w="100" w:type="dxa"/>
+              <w:bottom w:w="80" w:type="dxa"/>
+              <w:right w:w="100" w:type="dxa"/>
             </w:tcMar>
           </w:tcPr>
           <w:p>
             <w:r>
               <w:rPr>
-                <w:rFonts w:ascii="Courier New" w:cs="Courier New" w:eastAsia="Courier New" w:hAnsi="Courier New"/>
                 <w:sz w:val="20"/>
                 <w:szCs w:val="20"/>
               </w:rPr>
-              <w:t xml:space="preserve">Sample content</w:t>
+              <w:t>Sample content</w:t>
             </w:r>
           </w:p>
         </w:tc>
       </w:tr>
     </w:tbl>
+    <w:p/>
     <w:sectPr>
-      <w:headerReference w:type="default" r:id="rId7"/>
-      <w:footerReference w:type="default" r:id="rId8"/>
-      <w:pgSz w:w="12240" w:h="15840" w:orient="portrait"/>
+      <w:headerReference w:type="default" r:id="rId8"/>
+      <w:footerReference w:type="default" r:id="rId9"/>
+      <w:pgSz w:w="12240" w:h="15840"/>
       <w:pgMar w:top="1440" w:right="1440" w:bottom="1440" w:left="1440" w:header="708" w:footer="708" w:gutter="0"/>
-      <w:pgNumType/>
+      <w:cols w:space="720"/>
       <w:docGrid w:linePitch="360"/>
     </w:sectPr>
   </w:body>
 </w:document>
 </file>
 
-<file path=word/comments.xml><?xml version="1.0" encoding="utf-8"?>
-<w:comments xmlns:cx="http://schemas.microsoft.com/office/drawing/2014/chartex" xmlns:cx1="http://schemas.microsoft.com/office/drawing/2015/9/8/chartex" xmlns:cx2="http://schemas.microsoft.com/office/drawing/2015/10/21/chartex" xmlns:cx3="http://schemas.microsoft.com/office/drawing/2016/5/9/chartex" xmlns:cx4="http://schemas.microsoft.com/office/drawing/2016/5/10/chartex" xmlns:cx5="http://schemas.microsoft.com/office/drawing/2016/5/11/chartex" xmlns:cx6="http://schemas.microsoft.com/office/drawing/2016/5/12/chartex" xmlns:cx7="http://schemas.microsoft.com/office/drawing/2016/5/13/chartex" xmlns:cx8="http://schemas.microsoft.com/office/drawing/2016/5/14/chartex" xmlns:mc="http://schemas.openxmlformats.org/markup-compatibility/2006" xmlns:aink="http://schemas.microsoft.com/office/drawing/2016/ink" xmlns:am3d="http://schemas.microsoft.com/office/drawing/2017/model3d" xmlns:o="urn:schemas-microsoft-com:office:office" xmlns:r="http://schemas.openxmlformats.org/officeDocument/2006/relationships" xmlns:m="http://schemas.openxmlformats.org/officeDocument/2006/math" xmlns:v="urn:schemas-microsoft-com:vml" xmlns:wp14="http://schemas.microsoft.com/office/word/2010/wordprocessingDrawing" xmlns:wp="http://schemas.openxmlformats.org/drawingml/2006/wordprocessingDrawing" xmlns:w10="urn:schemas-microsoft-com:office:word" xmlns:w="http://schemas.openxmlformats.org/wordprocessingml/2006/main" xmlns:w14="http://schemas.microsoft.com/office/word/2010/wordml" xmlns:w15="http://schemas.microsoft.com/office/word/2012/wordml" xmlns:w16cex="http://schemas.microsoft.com/office/word/2018/wordml/cex" xmlns:w16cid="http://schemas.microsoft.com/office/word/2016/wordml/cid" xmlns:w16="http://schemas.microsoft.com/office/word/2018/wordml" xmlns:w16sdtdh="http://schemas.microsoft.com/office/word/2020/wordml/sdtdatahash" xmlns:w16se="http://schemas.microsoft.com/office/word/2015/wordml/symex" xmlns:wpg="http://schemas.microsoft.com/office/word/2010/wordprocessingGroup" xmlns:wpi="http://schemas.microsoft.com/office/word/2010/wordprocessingInk" xmlns:wne="http://schemas.microsoft.com/office/word/2006/wordml" xmlns:wps="http://schemas.microsoft.com/office/word/2010/wordprocessingShape"/>
-</file>
-
 <file path=word/endnotes.xml><?xml version="1.0" encoding="utf-8"?>
-<w:endnotes xmlns:wpc="http://schemas.microsoft.com/office/word/2010/wordprocessingCanvas" xmlns:mc="http://schemas.openxmlformats.org/markup-compatibility/2006" xmlns:o="urn:schemas-microsoft-com:office:office" xmlns:r="http://schemas.openxmlformats.org/officeDocument/2006/relationships" xmlns:m="http://schemas.openxmlformats.org/officeDocument/2006/math" xmlns:v="urn:schemas-microsoft-com:vml" xmlns:wp14="http://schemas.microsoft.com/office/word/2010/wordprocessingDrawing" xmlns:wp="http://schemas.openxmlformats.org/drawingml/2006/wordprocessingDrawing" xmlns:w10="urn:schemas-microsoft-com:office:word" xmlns:w="http://schemas.openxmlformats.org/wordprocessingml/2006/main" xmlns:w14="http://schemas.microsoft.com/office/word/2010/wordml" xmlns:w15="http://schemas.microsoft.com/office/word/2012/wordml" xmlns:wpg="http://schemas.microsoft.com/office/word/2010/wordprocessingGroup" xmlns:wpi="http://schemas.microsoft.com/office/word/2010/wordprocessingInk" xmlns:wne="http://schemas.microsoft.com/office/word/2006/wordml" xmlns:wps="http://schemas.microsoft.com/office/word/2010/wordprocessingShape" mc:Ignorable="w14 w15 wp14">
+<w:endnotes xmlns:wpc="http://schemas.microsoft.com/office/word/2010/wordprocessingCanvas" xmlns:cx="http://schemas.microsoft.com/office/drawing/2014/chartex" xmlns:cx1="http://schemas.microsoft.com/office/drawing/2015/9/8/chartex" xmlns:cx2="http://schemas.microsoft.com/office/drawing/2015/10/21/chartex" xmlns:cx3="http://schemas.microsoft.com/office/drawing/2016/5/9/chartex" xmlns:cx4="http://schemas.microsoft.com/office/drawing/2016/5/10/chartex" xmlns:cx5="http://schemas.microsoft.com/office/drawing/2016/5/11/chartex" xmlns:cx6="http://schemas.microsoft.com/office/drawing/2016/5/12/chartex" xmlns:cx7="http://schemas.microsoft.com/office/drawing/2016/5/13/chartex" xmlns:cx8="http://schemas.microsoft.com/office/drawing/2016/5/14/chartex" xmlns:mc="http://schemas.openxmlformats.org/markup-compatibility/2006" xmlns:m="http://schemas.openxmlformats.org/officeDocument/2006/math" xmlns:aink="http://schemas.microsoft.com/office/drawing/2016/ink" xmlns:am3d="http://schemas.microsoft.com/office/drawing/2017/model3d" xmlns:oel="http://schemas.microsoft.com/office/2019/extlst" xmlns:r="http://schemas.openxmlformats.org/officeDocument/2006/relationships" xmlns:wp14="http://schemas.microsoft.com/office/word/2010/wordprocessingDrawing" xmlns:wp="http://schemas.openxmlformats.org/drawingml/2006/wordprocessingDrawing" xmlns:wpg="http://schemas.microsoft.com/office/word/2010/wordprocessingGroup" xmlns:wpi="http://schemas.microsoft.com/office/word/2010/wordprocessingInk" xmlns:wps="http://schemas.microsoft.com/office/word/2010/wordprocessingShape" xmlns:o="urn:schemas-microsoft-com:office:office" xmlns:v="urn:schemas-microsoft-com:vml" xmlns:w10="urn:schemas-microsoft-com:office:word" xmlns:w="http://schemas.openxmlformats.org/wordprocessingml/2006/main" xmlns:w14="http://schemas.microsoft.com/office/word/2010/wordml" xmlns:w15="http://schemas.microsoft.com/office/word/2012/wordml" xmlns:w16cex="http://schemas.microsoft.com/office/word/2018/wordml/cex" xmlns:w16cid="http://schemas.microsoft.com/office/word/2016/wordml/cid" xmlns:w16="http://schemas.microsoft.com/office/word/2018/wordml" xmlns:w16sdtdh="http://schemas.microsoft.com/office/word/2020/wordml/sdtdatahash" xmlns:w16sdtfl="http://schemas.microsoft.com/office/word/2024/wordml/sdtformatlock" xmlns:w16se="http://schemas.microsoft.com/office/word/2015/wordml/symex" xmlns:w16du="http://schemas.microsoft.com/office/word/2023/wordml/word16du" xmlns:wne="http://schemas.microsoft.com/office/word/2006/wordml" mc:Ignorable="w14 w15 w16se w16cid w16 w16cex w16sdtdh w16sdtfl w16du wp14">
   <w:endnote w:type="separator" w:id="-1">
     <w:p>
       <w:pPr>
         <w:spacing w:after="0" w:line="240" w:lineRule="auto"/>
       </w:pPr>
-      <w:r>
-        <w:rPr>
-          <w:rStyle w:val="EndnoteReference"/>
-        </w:rPr>
-        <w:endnoteRef/>
-      </w:r>
       <w:r>
         <w:separator/>
       </w:r>
@@ -660,12 +677,6 @@
       <w:pPr>
         <w:spacing w:after="0" w:line="240" w:lineRule="auto"/>
       </w:pPr>
-      <w:r>
-        <w:rPr>
-          <w:rStyle w:val="EndnoteReference"/>
-        </w:rPr>
-        <w:endnoteRef/>
-      </w:r>
       <w:r>
         <w:continuationSeparator/>
       </w:r>
@@ -675,49 +686,104 @@
 </file>
 
 <file path=word/footer1.xml><?xml version="1.0" encoding="utf-8"?>
-<w:ftr xmlns:wpc="http://schemas.microsoft.com/office/word/2010/wordprocessingCanvas" xmlns:mc="http://schemas.openxmlformats.org/markup-compatibility/2006" xmlns:o="urn:schemas-microsoft-com:office:office" xmlns:r="http://schemas.openxmlformats.org/officeDocument/2006/relationships" xmlns:m="http://schemas.openxmlformats.org/officeDocument/2006/math" xmlns:v="urn:schemas-microsoft-com:vml" xmlns:wp14="http://schemas.microsoft.com/office/word/2010/wordprocessingDrawing" xmlns:wp="http://schemas.openxmlformats.org/drawingml/2006/wordprocessingDrawing" xmlns:w10="urn:schemas-microsoft-com:office:word" xmlns:w="http://schemas.openxmlformats.org/wordprocessingml/2006/main" xmlns:w14="http://schemas.microsoft.com/office/word/2010/wordml" xmlns:w15="http://schemas.microsoft.com/office/word/2012/wordml" xmlns:wpg="http://schemas.microsoft.com/office/word/2010/wordprocessingGroup" xmlns:wpi="http://schemas.microsoft.com/office/word/2010/wordprocessingInk" xmlns:wne="http://schemas.microsoft.com/office/word/2006/wordml" xmlns:wps="http://schemas.microsoft.com/office/word/2010/wordprocessingShape">
+<w:ftr xmlns:wpc="http://schemas.microsoft.com/office/word/2010/wordprocessingCanvas" xmlns:cx="http://schemas.microsoft.com/office/drawing/2014/chartex" xmlns:cx1="http://schemas.microsoft.com/office/drawing/2015/9/8/chartex" xmlns:cx2="http://schemas.microsoft.com/office/drawing/2015/10/21/chartex" xmlns:cx3="http://schemas.microsoft.com/office/drawing/2016/5/9/chartex" xmlns:cx4="http://schemas.microsoft.com/office/drawing/2016/5/10/chartex" xmlns:cx5="http://schemas.microsoft.com/office/drawing/2016/5/11/chartex" xmlns:cx6="http://schemas.microsoft.com/office/drawing/2016/5/12/chartex" xmlns:cx7="http://schemas.microsoft.com/office/drawing/2016/5/13/chartex" xmlns:cx8="http://schemas.microsoft.com/office/drawing/2016/5/14/chartex" xmlns:mc="http://schemas.openxmlformats.org/markup-compatibility/2006" xmlns:m="http://schemas.openxmlformats.org/officeDocument/2006/math" xmlns:aink="http://schemas.microsoft.com/office/drawing/2016/ink" xmlns:am3d="http://schemas.microsoft.com/office/drawing/2017/model3d" xmlns:oel="http://schemas.microsoft.com/office/2019/extlst" xmlns:r="http://schemas.openxmlformats.org/officeDocument/2006/relationships" xmlns:wp14="http://schemas.microsoft.com/office/word/2010/wordprocessingDrawing" xmlns:wp="http://schemas.openxmlformats.org/drawingml/2006/wordprocessingDrawing" xmlns:wpg="http://schemas.microsoft.com/office/word/2010/wordprocessingGroup" xmlns:wpi="http://schemas.microsoft.com/office/word/2010/wordprocessingInk" xmlns:wps="http://schemas.microsoft.com/office/word/2010/wordprocessingShape" xmlns:o="urn:schemas-microsoft-com:office:office" xmlns:v="urn:schemas-microsoft-com:vml" xmlns:w10="urn:schemas-microsoft-com:office:word" xmlns:w="http://schemas.openxmlformats.org/wordprocessingml/2006/main" xmlns:w14="http://schemas.microsoft.com/office/word/2010/wordml" xmlns:w15="http://schemas.microsoft.com/office/word/2012/wordml" xmlns:w16cex="http://schemas.microsoft.com/office/word/2018/wordml/cex" xmlns:w16cid="http://schemas.microsoft.com/office/word/2016/wordml/cid" xmlns:w16="http://schemas.microsoft.com/office/word/2018/wordml" xmlns:w16sdtdh="http://schemas.microsoft.com/office/word/2020/wordml/sdtdatahash" xmlns:w16sdtfl="http://schemas.microsoft.com/office/word/2024/wordml/sdtformatlock" xmlns:w16se="http://schemas.microsoft.com/office/word/2015/wordml/symex" xmlns:w16du="http://schemas.microsoft.com/office/word/2023/wordml/word16du" xmlns:wne="http://schemas.microsoft.com/office/word/2006/wordml" mc:Ignorable="w14 w15 w16se w16cid w16 w16cex w16sdtdh w16sdtfl w16du wp14">
   <w:p>
     <w:pPr>
       <w:pBdr>
-        <w:top w:val="single" w:color="000000" w:sz="4" w:space="4"/>
+        <w:top w:val="single" w:sz="4" w:space="4" w:color="000000"/>
       </w:pBdr>
       <w:tabs>
         <w:tab w:val="right" w:pos="9026"/>
       </w:tabs>
     </w:pPr>
+    <w:proofErr w:type="gramStart"/>
     <w:r>
       <w:rPr>
-        <w:rFonts w:ascii="Courier New" w:cs="Courier New" w:eastAsia="Courier New" w:hAnsi="Courier New"/>
         <w:color w:val="555555"/>
         <w:sz w:val="16"/>
         <w:szCs w:val="16"/>
       </w:rPr>
-      <w:t xml:space="preserve">error404.net  ::  !ignore → return "404: Message not found"</w:t>
+      <w:t>error404.net  :</w:t>
     </w:r>
+    <w:proofErr w:type="gramEnd"/>
     <w:r>
       <w:rPr>
-        <w:rFonts w:ascii="Courier New" w:cs="Courier New" w:eastAsia="Courier New" w:hAnsi="Courier New"/>
         <w:color w:val="555555"/>
         <w:sz w:val="16"/>
         <w:szCs w:val="16"/>
       </w:rPr>
-      <w:t xml:space="preserve">	page </w:t>
+      <w:t>:</w:t>
+    </w:r>
+    <w:proofErr w:type="gramStart"/>
+    <w:r>
+      <w:rPr>
+        <w:color w:val="555555"/>
+        <w:sz w:val="16"/>
+        <w:szCs w:val="16"/>
+      </w:rPr>
+      <w:t xml:space="preserve">  !ignore</w:t>
+    </w:r>
+    <w:proofErr w:type="gramEnd"/>
+    <w:r>
+      <w:rPr>
+        <w:color w:val="555555"/>
+        <w:sz w:val="16"/>
+        <w:szCs w:val="16"/>
+      </w:rPr>
+      <w:t xml:space="preserve"> → return "404: Message not found"</w:t>
     </w:r>
     <w:r>
       <w:rPr>
-        <w:rFonts w:ascii="Courier New" w:cs="Courier New" w:eastAsia="Courier New" w:hAnsi="Courier New"/>
+        <w:color w:val="555555"/>
+        <w:sz w:val="16"/>
+        <w:szCs w:val="16"/>
+      </w:rPr>
+      <w:tab/>
+      <w:t xml:space="preserve">page </w:t>
+    </w:r>
+    <w:r>
+      <w:rPr>
         <w:color w:val="555555"/>
         <w:sz w:val="16"/>
         <w:szCs w:val="16"/>
       </w:rPr>
       <w:fldChar w:fldCharType="begin"/>
-      <w:instrText xml:space="preserve">PAGE</w:instrText>
+    </w:r>
+    <w:r>
+      <w:rPr>
+        <w:color w:val="555555"/>
+        <w:sz w:val="16"/>
+        <w:szCs w:val="16"/>
+      </w:rPr>
+      <w:instrText>PAGE</w:instrText>
+    </w:r>
+    <w:r>
+      <w:rPr>
+        <w:color w:val="555555"/>
+        <w:sz w:val="16"/>
+        <w:szCs w:val="16"/>
+      </w:rPr>
       <w:fldChar w:fldCharType="separate"/>
+    </w:r>
+    <w:r>
+      <w:rPr>
+        <w:noProof/>
+        <w:color w:val="555555"/>
+        <w:sz w:val="16"/>
+        <w:szCs w:val="16"/>
+      </w:rPr>
+      <w:t>1</w:t>
+    </w:r>
+    <w:r>
+      <w:rPr>
+        <w:color w:val="555555"/>
+        <w:sz w:val="16"/>
+        <w:szCs w:val="16"/>
+      </w:rPr>
       <w:fldChar w:fldCharType="end"/>
     </w:r>
     <w:r>
       <w:rPr>
-        <w:rFonts w:ascii="Courier New" w:cs="Courier New" w:eastAsia="Courier New" w:hAnsi="Courier New"/>
         <w:color w:val="555555"/>
         <w:sz w:val="16"/>
         <w:szCs w:val="16"/>
@@ -726,14 +792,43 @@
     </w:r>
     <w:r>
       <w:rPr>
-        <w:rFonts w:ascii="Courier New" w:cs="Courier New" w:eastAsia="Courier New" w:hAnsi="Courier New"/>
         <w:color w:val="555555"/>
         <w:sz w:val="16"/>
         <w:szCs w:val="16"/>
       </w:rPr>
       <w:fldChar w:fldCharType="begin"/>
-      <w:instrText xml:space="preserve">NUMPAGES</w:instrText>
+    </w:r>
+    <w:r>
+      <w:rPr>
+        <w:color w:val="555555"/>
+        <w:sz w:val="16"/>
+        <w:szCs w:val="16"/>
+      </w:rPr>
+      <w:instrText>NUMPAGES</w:instrText>
+    </w:r>
+    <w:r>
+      <w:rPr>
+        <w:color w:val="555555"/>
+        <w:sz w:val="16"/>
+        <w:szCs w:val="16"/>
+      </w:rPr>
       <w:fldChar w:fldCharType="separate"/>
+    </w:r>
+    <w:r>
+      <w:rPr>
+        <w:noProof/>
+        <w:color w:val="555555"/>
+        <w:sz w:val="16"/>
+        <w:szCs w:val="16"/>
+      </w:rPr>
+      <w:t>2</w:t>
+    </w:r>
+    <w:r>
+      <w:rPr>
+        <w:color w:val="555555"/>
+        <w:sz w:val="16"/>
+        <w:szCs w:val="16"/>
+      </w:rPr>
       <w:fldChar w:fldCharType="end"/>
     </w:r>
   </w:p>
@@ -741,18 +836,12 @@
 </file>
 
 <file path=word/footnotes.xml><?xml version="1.0" encoding="utf-8"?>
-<w:footnotes xmlns:wpc="http://schemas.microsoft.com/office/word/2010/wordprocessingCanvas" xmlns:mc="http://schemas.openxmlformats.org/markup-compatibility/2006" xmlns:o="urn:schemas-microsoft-com:office:office" xmlns:r="http://schemas.openxmlformats.org/officeDocument/2006/relationships" xmlns:m="http://schemas.openxmlformats.org/officeDocument/2006/math" xmlns:v="urn:schemas-microsoft-com:vml" xmlns:wp14="http://schemas.microsoft.com/office/word/2010/wordprocessingDrawing" xmlns:wp="http://schemas.openxmlformats.org/drawingml/2006/wordprocessingDrawing" xmlns:w10="urn:schemas-microsoft-com:office:word" xmlns:w="http://schemas.openxmlformats.org/wordprocessingml/2006/main" xmlns:w14="http://schemas.microsoft.com/office/word/2010/wordml" xmlns:w15="http://schemas.microsoft.com/office/word/2012/wordml" xmlns:wpg="http://schemas.microsoft.com/office/word/2010/wordprocessingGroup" xmlns:wpi="http://schemas.microsoft.com/office/word/2010/wordprocessingInk" xmlns:wne="http://schemas.microsoft.com/office/word/2006/wordml" xmlns:wps="http://schemas.microsoft.com/office/word/2010/wordprocessingShape" mc:Ignorable="w14 w15 wp14">
+<w:footnotes xmlns:wpc="http://schemas.microsoft.com/office/word/2010/wordprocessingCanvas" xmlns:cx="http://schemas.microsoft.com/office/drawing/2014/chartex" xmlns:cx1="http://schemas.microsoft.com/office/drawing/2015/9/8/chartex" xmlns:cx2="http://schemas.microsoft.com/office/drawing/2015/10/21/chartex" xmlns:cx3="http://schemas.microsoft.com/office/drawing/2016/5/9/chartex" xmlns:cx4="http://schemas.microsoft.com/office/drawing/2016/5/10/chartex" xmlns:cx5="http://schemas.microsoft.com/office/drawing/2016/5/11/chartex" xmlns:cx6="http://schemas.microsoft.com/office/drawing/2016/5/12/chartex" xmlns:cx7="http://schemas.microsoft.com/office/drawing/2016/5/13/chartex" xmlns:cx8="http://schemas.microsoft.com/office/drawing/2016/5/14/chartex" xmlns:mc="http://schemas.openxmlformats.org/markup-compatibility/2006" xmlns:m="http://schemas.openxmlformats.org/officeDocument/2006/math" xmlns:aink="http://schemas.microsoft.com/office/drawing/2016/ink" xmlns:am3d="http://schemas.microsoft.com/office/drawing/2017/model3d" xmlns:oel="http://schemas.microsoft.com/office/2019/extlst" xmlns:r="http://schemas.openxmlformats.org/officeDocument/2006/relationships" xmlns:wp14="http://schemas.microsoft.com/office/word/2010/wordprocessingDrawing" xmlns:wp="http://schemas.openxmlformats.org/drawingml/2006/wordprocessingDrawing" xmlns:wpg="http://schemas.microsoft.com/office/word/2010/wordprocessingGroup" xmlns:wpi="http://schemas.microsoft.com/office/word/2010/wordprocessingInk" xmlns:wps="http://schemas.microsoft.com/office/word/2010/wordprocessingShape" xmlns:o="urn:schemas-microsoft-com:office:office" xmlns:v="urn:schemas-microsoft-com:vml" xmlns:w10="urn:schemas-microsoft-com:office:word" xmlns:w="http://schemas.openxmlformats.org/wordprocessingml/2006/main" xmlns:w14="http://schemas.microsoft.com/office/word/2010/wordml" xmlns:w15="http://schemas.microsoft.com/office/word/2012/wordml" xmlns:w16cex="http://schemas.microsoft.com/office/word/2018/wordml/cex" xmlns:w16cid="http://schemas.microsoft.com/office/word/2016/wordml/cid" xmlns:w16="http://schemas.microsoft.com/office/word/2018/wordml" xmlns:w16sdtdh="http://schemas.microsoft.com/office/word/2020/wordml/sdtdatahash" xmlns:w16sdtfl="http://schemas.microsoft.com/office/word/2024/wordml/sdtformatlock" xmlns:w16se="http://schemas.microsoft.com/office/word/2015/wordml/symex" xmlns:w16du="http://schemas.microsoft.com/office/word/2023/wordml/word16du" xmlns:wne="http://schemas.microsoft.com/office/word/2006/wordml" mc:Ignorable="w14 w15 w16se w16cid w16 w16cex w16sdtdh w16sdtfl w16du wp14">
   <w:footnote w:type="separator" w:id="-1">
     <w:p>
       <w:pPr>
         <w:spacing w:after="0" w:line="240" w:lineRule="auto"/>
       </w:pPr>
-      <w:r>
-        <w:rPr>
-          <w:rStyle w:val="FootnoteReference"/>
-        </w:rPr>
-        <w:footnoteRef/>
-      </w:r>
       <w:r>
         <w:separator/>
       </w:r>
@@ -763,12 +852,6 @@
       <w:pPr>
         <w:spacing w:after="0" w:line="240" w:lineRule="auto"/>
       </w:pPr>
-      <w:r>
-        <w:rPr>
-          <w:rStyle w:val="FootnoteReference"/>
-        </w:rPr>
-        <w:footnoteRef/>
-      </w:r>
       <w:r>
         <w:continuationSeparator/>
       </w:r>
@@ -778,11 +861,11 @@
 </file>
 
 <file path=word/header1.xml><?xml version="1.0" encoding="utf-8"?>
-<w:hdr xmlns:wpc="http://schemas.microsoft.com/office/word/2010/wordprocessingCanvas" xmlns:mc="http://schemas.openxmlformats.org/markup-compatibility/2006" xmlns:o="urn:schemas-microsoft-com:office:office" xmlns:r="http://schemas.openxmlformats.org/officeDocument/2006/relationships" xmlns:m="http://schemas.openxmlformats.org/officeDocument/2006/math" xmlns:v="urn:schemas-microsoft-com:vml" xmlns:wp14="http://schemas.microsoft.com/office/word/2010/wordprocessingDrawing" xmlns:wp="http://schemas.openxmlformats.org/drawingml/2006/wordprocessingDrawing" xmlns:w10="urn:schemas-microsoft-com:office:word" xmlns:w="http://schemas.openxmlformats.org/wordprocessingml/2006/main" xmlns:w14="http://schemas.microsoft.com/office/word/2010/wordml" xmlns:w15="http://schemas.microsoft.com/office/word/2012/wordml" xmlns:wpg="http://schemas.microsoft.com/office/word/2010/wordprocessingGroup" xmlns:wpi="http://schemas.microsoft.com/office/word/2010/wordprocessingInk" xmlns:wne="http://schemas.microsoft.com/office/word/2006/wordml" xmlns:wps="http://schemas.microsoft.com/office/word/2010/wordprocessingShape" xmlns:cx="http://schemas.microsoft.com/office/drawing/2014/chartex" xmlns:cx1="http://schemas.microsoft.com/office/drawing/2015/9/8/chartex" xmlns:cx2="http://schemas.microsoft.com/office/drawing/2015/10/21/chartex" xmlns:cx3="http://schemas.microsoft.com/office/drawing/2016/5/9/chartex" xmlns:cx4="http://schemas.microsoft.com/office/drawing/2016/5/10/chartex" xmlns:cx5="http://schemas.microsoft.com/office/drawing/2016/5/11/chartex" xmlns:cx6="http://schemas.microsoft.com/office/drawing/2016/5/12/chartex" xmlns:cx7="http://schemas.microsoft.com/office/drawing/2016/5/13/chartex" xmlns:cx8="http://schemas.microsoft.com/office/drawing/2016/5/14/chartex" xmlns:w16cid="http://schemas.microsoft.com/office/word/2016/wordml/cid" xmlns:w16se="http://schemas.microsoft.com/office/word/2015/wordml/symex">
+<w:hdr xmlns:wpc="http://schemas.microsoft.com/office/word/2010/wordprocessingCanvas" xmlns:cx="http://schemas.microsoft.com/office/drawing/2014/chartex" xmlns:cx1="http://schemas.microsoft.com/office/drawing/2015/9/8/chartex" xmlns:cx2="http://schemas.microsoft.com/office/drawing/2015/10/21/chartex" xmlns:cx3="http://schemas.microsoft.com/office/drawing/2016/5/9/chartex" xmlns:cx4="http://schemas.microsoft.com/office/drawing/2016/5/10/chartex" xmlns:cx5="http://schemas.microsoft.com/office/drawing/2016/5/11/chartex" xmlns:cx6="http://schemas.microsoft.com/office/drawing/2016/5/12/chartex" xmlns:cx7="http://schemas.microsoft.com/office/drawing/2016/5/13/chartex" xmlns:cx8="http://schemas.microsoft.com/office/drawing/2016/5/14/chartex" xmlns:mc="http://schemas.openxmlformats.org/markup-compatibility/2006" xmlns:m="http://schemas.openxmlformats.org/officeDocument/2006/math" xmlns:aink="http://schemas.microsoft.com/office/drawing/2016/ink" xmlns:am3d="http://schemas.microsoft.com/office/drawing/2017/model3d" xmlns:oel="http://schemas.microsoft.com/office/2019/extlst" xmlns:r="http://schemas.openxmlformats.org/officeDocument/2006/relationships" xmlns:wp14="http://schemas.microsoft.com/office/word/2010/wordprocessingDrawing" xmlns:wp="http://schemas.openxmlformats.org/drawingml/2006/wordprocessingDrawing" xmlns:wpg="http://schemas.microsoft.com/office/word/2010/wordprocessingGroup" xmlns:wpi="http://schemas.microsoft.com/office/word/2010/wordprocessingInk" xmlns:wps="http://schemas.microsoft.com/office/word/2010/wordprocessingShape" xmlns:o="urn:schemas-microsoft-com:office:office" xmlns:v="urn:schemas-microsoft-com:vml" xmlns:w10="urn:schemas-microsoft-com:office:word" xmlns:w="http://schemas.openxmlformats.org/wordprocessingml/2006/main" xmlns:w14="http://schemas.microsoft.com/office/word/2010/wordml" xmlns:w15="http://schemas.microsoft.com/office/word/2012/wordml" xmlns:w16cex="http://schemas.microsoft.com/office/word/2018/wordml/cex" xmlns:w16cid="http://schemas.microsoft.com/office/word/2016/wordml/cid" xmlns:w16="http://schemas.microsoft.com/office/word/2018/wordml" xmlns:w16sdtdh="http://schemas.microsoft.com/office/word/2020/wordml/sdtdatahash" xmlns:w16sdtfl="http://schemas.microsoft.com/office/word/2024/wordml/sdtformatlock" xmlns:w16se="http://schemas.microsoft.com/office/word/2015/wordml/symex" xmlns:w16du="http://schemas.microsoft.com/office/word/2023/wordml/word16du" xmlns:wne="http://schemas.microsoft.com/office/word/2006/wordml" mc:Ignorable="w14 w15 w16se w16cid w16 w16cex w16sdtdh w16sdtfl w16du wp14">
   <w:p>
     <w:pPr>
       <w:pBdr>
-        <w:bottom w:val="single" w:color="000000" w:sz="4" w:space="4"/>
+        <w:bottom w:val="single" w:sz="4" w:space="4" w:color="000000"/>
       </w:pBdr>
       <w:tabs>
         <w:tab w:val="right" w:pos="9026"/>
@@ -790,32 +873,97 @@
     </w:pPr>
     <w:r>
       <w:rPr>
-        <w:rFonts w:ascii="Courier New" w:cs="Courier New" w:eastAsia="Courier New" w:hAnsi="Courier New"/>
         <w:b/>
         <w:bCs/>
         <w:sz w:val="16"/>
         <w:szCs w:val="16"/>
       </w:rPr>
-      <w:t xml:space="preserve">ERROR404.NET</w:t>
+      <w:t>ERROR404.NET</w:t>
     </w:r>
+    <w:proofErr w:type="gramStart"/>
     <w:r>
       <w:rPr>
-        <w:rFonts w:ascii="Courier New" w:cs="Courier New" w:eastAsia="Courier New" w:hAnsi="Courier New"/>
         <w:color w:val="555555"/>
         <w:sz w:val="16"/>
         <w:szCs w:val="16"/>
       </w:rPr>
-      <w:t xml:space="preserve">	::  BRAND — PRINT/CORPORATE MODE</w:t>
+      <w:tab/>
+      <w:t>::</w:t>
+    </w:r>
+    <w:proofErr w:type="gramEnd"/>
+    <w:r>
+      <w:rPr>
+        <w:color w:val="555555"/>
+        <w:sz w:val="16"/>
+        <w:szCs w:val="16"/>
+      </w:rPr>
+      <w:t xml:space="preserve">  BRAND — PRINT/CORPORATE MODE</w:t>
     </w:r>
   </w:p>
 </w:hdr>
 </file>
 
 <file path=word/numbering.xml><?xml version="1.0" encoding="utf-8"?>
-<w:numbering xmlns:wpc="http://schemas.microsoft.com/office/word/2010/wordprocessingCanvas" xmlns:mc="http://schemas.openxmlformats.org/markup-compatibility/2006" xmlns:o="urn:schemas-microsoft-com:office:office" xmlns:r="http://schemas.openxmlformats.org/officeDocument/2006/relationships" xmlns:m="http://schemas.openxmlformats.org/officeDocument/2006/math" xmlns:v="urn:schemas-microsoft-com:vml" xmlns:wp14="http://schemas.microsoft.com/office/word/2010/wordprocessingDrawing" xmlns:wp="http://schemas.openxmlformats.org/drawingml/2006/wordprocessingDrawing" xmlns:w10="urn:schemas-microsoft-com:office:word" xmlns:w="http://schemas.openxmlformats.org/wordprocessingml/2006/main" xmlns:w14="http://schemas.microsoft.com/office/word/2010/wordml" xmlns:w15="http://schemas.microsoft.com/office/word/2012/wordml" xmlns:wpg="http://schemas.microsoft.com/office/word/2010/wordprocessingGroup" xmlns:wpi="http://schemas.microsoft.com/office/word/2010/wordprocessingInk" xmlns:wne="http://schemas.microsoft.com/office/word/2006/wordml" xmlns:wps="http://schemas.microsoft.com/office/word/2010/wordprocessingShape" mc:Ignorable="w14 w15 wp14">
+<w:numbering xmlns:wpc="http://schemas.microsoft.com/office/word/2010/wordprocessingCanvas" xmlns:cx="http://schemas.microsoft.com/office/drawing/2014/chartex" xmlns:cx1="http://schemas.microsoft.com/office/drawing/2015/9/8/chartex" xmlns:cx2="http://schemas.microsoft.com/office/drawing/2015/10/21/chartex" xmlns:cx3="http://schemas.microsoft.com/office/drawing/2016/5/9/chartex" xmlns:cx4="http://schemas.microsoft.com/office/drawing/2016/5/10/chartex" xmlns:cx5="http://schemas.microsoft.com/office/drawing/2016/5/11/chartex" xmlns:cx6="http://schemas.microsoft.com/office/drawing/2016/5/12/chartex" xmlns:cx7="http://schemas.microsoft.com/office/drawing/2016/5/13/chartex" xmlns:cx8="http://schemas.microsoft.com/office/drawing/2016/5/14/chartex" xmlns:mc="http://schemas.openxmlformats.org/markup-compatibility/2006" xmlns:m="http://schemas.openxmlformats.org/officeDocument/2006/math" xmlns:aink="http://schemas.microsoft.com/office/drawing/2016/ink" xmlns:am3d="http://schemas.microsoft.com/office/drawing/2017/model3d" xmlns:oel="http://schemas.microsoft.com/office/2019/extlst" xmlns:r="http://schemas.openxmlformats.org/officeDocument/2006/relationships" xmlns:wp14="http://schemas.microsoft.com/office/word/2010/wordprocessingDrawing" xmlns:wp="http://schemas.openxmlformats.org/drawingml/2006/wordprocessingDrawing" xmlns:wpg="http://schemas.microsoft.com/office/word/2010/wordprocessingGroup" xmlns:wpi="http://schemas.microsoft.com/office/word/2010/wordprocessingInk" xmlns:wps="http://schemas.microsoft.com/office/word/2010/wordprocessingShape" xmlns:o="urn:schemas-microsoft-com:office:office" xmlns:v="urn:schemas-microsoft-com:vml" xmlns:w10="urn:schemas-microsoft-com:office:word" xmlns:w="http://schemas.openxmlformats.org/wordprocessingml/2006/main" xmlns:w14="http://schemas.microsoft.com/office/word/2010/wordml" xmlns:w15="http://schemas.microsoft.com/office/word/2012/wordml" xmlns:w16cex="http://schemas.microsoft.com/office/word/2018/wordml/cex" xmlns:w16cid="http://schemas.microsoft.com/office/word/2016/wordml/cid" xmlns:w16="http://schemas.microsoft.com/office/word/2018/wordml" xmlns:w16sdtdh="http://schemas.microsoft.com/office/word/2020/wordml/sdtdatahash" xmlns:w16sdtfl="http://schemas.microsoft.com/office/word/2024/wordml/sdtformatlock" xmlns:w16se="http://schemas.microsoft.com/office/word/2015/wordml/symex" xmlns:w16du="http://schemas.microsoft.com/office/word/2023/wordml/word16du" xmlns:wne="http://schemas.microsoft.com/office/word/2006/wordml" mc:Ignorable="w14 w15 w16se w16cid w16 w16cex w16sdtdh w16sdtfl w16du wp14">
+  <w:abstractNum w:abstractNumId="0" w15:restartNumberingAfterBreak="0">
+    <w:nsid w:val="69AC3926"/>
+    <w:multiLevelType w:val="hybridMultilevel"/>
+    <w:tmpl w:val="32020138"/>
+    <w:lvl w:ilvl="0" w:tplc="119E4F9C">
+      <w:start w:val="1"/>
+      <w:numFmt w:val="bullet"/>
+      <w:lvlText w:val="•"/>
+      <w:lvlJc w:val="left"/>
+      <w:pPr>
+        <w:ind w:left="431" w:hanging="288"/>
+      </w:pPr>
+    </w:lvl>
+    <w:lvl w:ilvl="1" w:tplc="82124CEC">
+      <w:numFmt w:val="decimal"/>
+      <w:lvlText w:val=""/>
+      <w:lvlJc w:val="left"/>
+    </w:lvl>
+    <w:lvl w:ilvl="2" w:tplc="6F46394C">
+      <w:numFmt w:val="decimal"/>
+      <w:lvlText w:val=""/>
+      <w:lvlJc w:val="left"/>
+    </w:lvl>
+    <w:lvl w:ilvl="3" w:tplc="894E0D6A">
+      <w:numFmt w:val="decimal"/>
+      <w:lvlText w:val=""/>
+      <w:lvlJc w:val="left"/>
+    </w:lvl>
+    <w:lvl w:ilvl="4" w:tplc="FD401066">
+      <w:numFmt w:val="decimal"/>
+      <w:lvlText w:val=""/>
+      <w:lvlJc w:val="left"/>
+    </w:lvl>
+    <w:lvl w:ilvl="5" w:tplc="9FE22202">
+      <w:numFmt w:val="decimal"/>
+      <w:lvlText w:val=""/>
+      <w:lvlJc w:val="left"/>
+    </w:lvl>
+    <w:lvl w:ilvl="6" w:tplc="141A6664">
+      <w:numFmt w:val="decimal"/>
+      <w:lvlText w:val=""/>
+      <w:lvlJc w:val="left"/>
+    </w:lvl>
+    <w:lvl w:ilvl="7" w:tplc="A38A7DEA">
+      <w:numFmt w:val="decimal"/>
+      <w:lvlText w:val=""/>
+      <w:lvlJc w:val="left"/>
+    </w:lvl>
+    <w:lvl w:ilvl="8" w:tplc="1CC4FA94">
+      <w:numFmt w:val="decimal"/>
+      <w:lvlText w:val=""/>
+      <w:lvlJc w:val="left"/>
+    </w:lvl>
+  </w:abstractNum>
   <w:abstractNum w:abstractNumId="1" w15:restartNumberingAfterBreak="0">
+    <w:nsid w:val="6B0E5851"/>
     <w:multiLevelType w:val="hybridMultilevel"/>
-    <w:lvl w:ilvl="0" w15:tentative="1">
+    <w:tmpl w:val="C7468144"/>
+    <w:lvl w:ilvl="0" w:tplc="B246A630">
       <w:start w:val="1"/>
       <w:numFmt w:val="bullet"/>
       <w:lvlText w:val="●"/>
@@ -824,7 +972,7 @@
         <w:ind w:left="720" w:hanging="360"/>
       </w:pPr>
     </w:lvl>
-    <w:lvl w:ilvl="1" w15:tentative="1">
+    <w:lvl w:ilvl="1" w:tplc="0E1EDD50">
       <w:start w:val="1"/>
       <w:numFmt w:val="bullet"/>
       <w:lvlText w:val="○"/>
@@ -833,7 +981,7 @@
         <w:ind w:left="1440" w:hanging="360"/>
       </w:pPr>
     </w:lvl>
-    <w:lvl w:ilvl="2" w15:tentative="1">
+    <w:lvl w:ilvl="2" w:tplc="E4F2CC6A">
       <w:start w:val="1"/>
       <w:numFmt w:val="bullet"/>
       <w:lvlText w:val="■"/>
@@ -842,7 +990,7 @@
         <w:ind w:left="2160" w:hanging="360"/>
       </w:pPr>
     </w:lvl>
-    <w:lvl w:ilvl="3" w15:tentative="1">
+    <w:lvl w:ilvl="3" w:tplc="7F10FD0C">
       <w:start w:val="1"/>
       <w:numFmt w:val="bullet"/>
       <w:lvlText w:val="●"/>
@@ -851,7 +999,7 @@
         <w:ind w:left="2880" w:hanging="360"/>
       </w:pPr>
     </w:lvl>
-    <w:lvl w:ilvl="4" w15:tentative="1">
+    <w:lvl w:ilvl="4" w:tplc="7028176C">
       <w:start w:val="1"/>
       <w:numFmt w:val="bullet"/>
       <w:lvlText w:val="○"/>
@@ -860,7 +1008,7 @@
         <w:ind w:left="3600" w:hanging="360"/>
       </w:pPr>
     </w:lvl>
-    <w:lvl w:ilvl="5" w15:tentative="1">
+    <w:lvl w:ilvl="5" w:tplc="E2186800">
       <w:start w:val="1"/>
       <w:numFmt w:val="bullet"/>
       <w:lvlText w:val="■"/>
@@ -869,7 +1017,7 @@
         <w:ind w:left="4320" w:hanging="360"/>
       </w:pPr>
     </w:lvl>
-    <w:lvl w:ilvl="6" w15:tentative="1">
+    <w:lvl w:ilvl="6" w:tplc="3F645BC0">
       <w:start w:val="1"/>
       <w:numFmt w:val="bullet"/>
       <w:lvlText w:val="●"/>
@@ -878,7 +1026,7 @@
         <w:ind w:left="5040" w:hanging="360"/>
       </w:pPr>
     </w:lvl>
-    <w:lvl w:ilvl="7" w15:tentative="1">
+    <w:lvl w:ilvl="7" w:tplc="3BCC937E">
       <w:start w:val="1"/>
       <w:numFmt w:val="bullet"/>
       <w:lvlText w:val="●"/>
@@ -887,7 +1035,7 @@
         <w:ind w:left="5760" w:hanging="360"/>
       </w:pPr>
     </w:lvl>
-    <w:lvl w:ilvl="8" w15:tentative="1">
+    <w:lvl w:ilvl="8" w:tplc="B2C0FB52">
       <w:start w:val="1"/>
       <w:numFmt w:val="bullet"/>
       <w:lvlText w:val="●"/>
@@ -898,20 +1046,10 @@
     </w:lvl>
   </w:abstractNum>
   <w:abstractNum w:abstractNumId="2" w15:restartNumberingAfterBreak="0">
+    <w:nsid w:val="7F3571D9"/>
     <w:multiLevelType w:val="hybridMultilevel"/>
-    <w:lvl w:ilvl="0" w15:tentative="1">
-      <w:start w:val="1"/>
-      <w:numFmt w:val="bullet"/>
-      <w:lvlText w:val="•"/>
-      <w:lvlJc w:val="left"/>
-      <w:pPr>
-        <w:ind w:left="431" w:hanging="288"/>
-      </w:pPr>
-    </w:lvl>
-  </w:abstractNum>
-  <w:abstractNum w:abstractNumId="3" w15:restartNumberingAfterBreak="0">
-    <w:multiLevelType w:val="hybridMultilevel"/>
-    <w:lvl w:ilvl="0" w15:tentative="1">
+    <w:tmpl w:val="C64E4E82"/>
+    <w:lvl w:ilvl="0" w:tplc="499EC428">
       <w:start w:val="1"/>
       <w:numFmt w:val="decimal"/>
       <w:lvlText w:val="%1."/>
@@ -920,21 +1058,61 @@
         <w:ind w:left="431" w:hanging="288"/>
       </w:pPr>
     </w:lvl>
+    <w:lvl w:ilvl="1" w:tplc="AA46D61E">
+      <w:numFmt w:val="decimal"/>
+      <w:lvlText w:val=""/>
+      <w:lvlJc w:val="left"/>
+    </w:lvl>
+    <w:lvl w:ilvl="2" w:tplc="F96E8F4A">
+      <w:numFmt w:val="decimal"/>
+      <w:lvlText w:val=""/>
+      <w:lvlJc w:val="left"/>
+    </w:lvl>
+    <w:lvl w:ilvl="3" w:tplc="883AC10C">
+      <w:numFmt w:val="decimal"/>
+      <w:lvlText w:val=""/>
+      <w:lvlJc w:val="left"/>
+    </w:lvl>
+    <w:lvl w:ilvl="4" w:tplc="811233AC">
+      <w:numFmt w:val="decimal"/>
+      <w:lvlText w:val=""/>
+      <w:lvlJc w:val="left"/>
+    </w:lvl>
+    <w:lvl w:ilvl="5" w:tplc="C11E2CF4">
+      <w:numFmt w:val="decimal"/>
+      <w:lvlText w:val=""/>
+      <w:lvlJc w:val="left"/>
+    </w:lvl>
+    <w:lvl w:ilvl="6" w:tplc="F2E4A0A2">
+      <w:numFmt w:val="decimal"/>
+      <w:lvlText w:val=""/>
+      <w:lvlJc w:val="left"/>
+    </w:lvl>
+    <w:lvl w:ilvl="7" w:tplc="F34EBD66">
+      <w:numFmt w:val="decimal"/>
+      <w:lvlText w:val=""/>
+      <w:lvlJc w:val="left"/>
+    </w:lvl>
+    <w:lvl w:ilvl="8" w:tplc="973EC120">
+      <w:numFmt w:val="decimal"/>
+      <w:lvlText w:val=""/>
+      <w:lvlJc w:val="left"/>
+    </w:lvl>
   </w:abstractNum>
-  <w:num w:numId="1">
+  <w:num w:numId="1" w16cid:durableId="15741284">
     <w:abstractNumId w:val="1"/>
     <w:lvlOverride w:ilvl="0">
       <w:startOverride w:val="1"/>
     </w:lvlOverride>
   </w:num>
-  <w:num w:numId="2">
-    <w:abstractNumId w:val="2"/>
+  <w:num w:numId="2" w16cid:durableId="445004499">
+    <w:abstractNumId w:val="0"/>
     <w:lvlOverride w:ilvl="0">
       <w:startOverride w:val="1"/>
     </w:lvlOverride>
   </w:num>
-  <w:num w:numId="3">
-    <w:abstractNumId w:val="3"/>
+  <w:num w:numId="3" w16cid:durableId="861672119">
+    <w:abstractNumId w:val="2"/>
     <w:lvlOverride w:ilvl="0">
       <w:startOverride w:val="1"/>
     </w:lvlOverride>
@@ -943,66 +1121,472 @@
 </file>
 
 <file path=word/styles.xml><?xml version="1.0" encoding="utf-8"?>
-<w:styles xmlns:mc="http://schemas.openxmlformats.org/markup-compatibility/2006" xmlns:r="http://schemas.openxmlformats.org/officeDocument/2006/relationships" xmlns:w="http://schemas.openxmlformats.org/wordprocessingml/2006/main" xmlns:w14="http://schemas.microsoft.com/office/word/2010/wordml" xmlns:w15="http://schemas.microsoft.com/office/word/2012/wordml" mc:Ignorable="w14 w15">
+<w:styles xmlns:mc="http://schemas.openxmlformats.org/markup-compatibility/2006" xmlns:r="http://schemas.openxmlformats.org/officeDocument/2006/relationships" xmlns:w="http://schemas.openxmlformats.org/wordprocessingml/2006/main" xmlns:w14="http://schemas.microsoft.com/office/word/2010/wordml" xmlns:w15="http://schemas.microsoft.com/office/word/2012/wordml" xmlns:w16cex="http://schemas.microsoft.com/office/word/2018/wordml/cex" xmlns:w16cid="http://schemas.microsoft.com/office/word/2016/wordml/cid" xmlns:w16="http://schemas.microsoft.com/office/word/2018/wordml" xmlns:w16sdtdh="http://schemas.microsoft.com/office/word/2020/wordml/sdtdatahash" xmlns:w16sdtfl="http://schemas.microsoft.com/office/word/2024/wordml/sdtformatlock" xmlns:w16se="http://schemas.microsoft.com/office/word/2015/wordml/symex" xmlns:w16du="http://schemas.microsoft.com/office/word/2023/wordml/word16du" mc:Ignorable="w14 w15 w16se w16cid w16 w16cex w16sdtdh w16sdtfl w16du">
   <w:docDefaults>
     <w:rPrDefault>
       <w:rPr>
-        <w:rFonts w:ascii="Courier New" w:cs="Courier New" w:eastAsia="Courier New" w:hAnsi="Courier New"/>
+        <w:rFonts w:ascii="Courier New" w:eastAsia="Courier New" w:hAnsi="Courier New" w:cs="Courier New"/>
         <w:color w:val="000000"/>
         <w:sz w:val="22"/>
         <w:szCs w:val="22"/>
+        <w:lang w:val="en-US" w:eastAsia="en-US" w:bidi="ar-SA"/>
       </w:rPr>
     </w:rPrDefault>
     <w:pPrDefault/>
   </w:docDefaults>
-  <w:style w:type="paragraph" w:styleId="Title">
-    <w:name w:val="Title"/>
+  <w:latentStyles w:defLockedState="0" w:defUIPriority="99" w:defSemiHidden="0" w:defUnhideWhenUsed="0" w:defQFormat="0" w:count="376">
+    <w:lsdException w:name="Normal" w:uiPriority="0" w:qFormat="1"/>
+    <w:lsdException w:name="heading 1" w:uiPriority="9" w:qFormat="1"/>
+    <w:lsdException w:name="heading 2" w:semiHidden="1" w:uiPriority="9" w:unhideWhenUsed="1" w:qFormat="1"/>
+    <w:lsdException w:name="heading 3" w:semiHidden="1" w:uiPriority="9" w:unhideWhenUsed="1" w:qFormat="1"/>
+    <w:lsdException w:name="heading 4" w:semiHidden="1" w:uiPriority="9" w:unhideWhenUsed="1" w:qFormat="1"/>
+    <w:lsdException w:name="heading 5" w:semiHidden="1" w:uiPriority="9" w:unhideWhenUsed="1" w:qFormat="1"/>
+    <w:lsdException w:name="heading 6" w:semiHidden="1" w:uiPriority="9" w:unhideWhenUsed="1" w:qFormat="1"/>
+    <w:lsdException w:name="heading 7" w:semiHidden="1" w:uiPriority="9" w:unhideWhenUsed="1" w:qFormat="1"/>
+    <w:lsdException w:name="heading 8" w:semiHidden="1" w:uiPriority="9" w:unhideWhenUsed="1" w:qFormat="1"/>
+    <w:lsdException w:name="heading 9" w:semiHidden="1" w:uiPriority="9" w:unhideWhenUsed="1" w:qFormat="1"/>
+    <w:lsdException w:name="index 1" w:semiHidden="1" w:unhideWhenUsed="1"/>
+    <w:lsdException w:name="index 2" w:semiHidden="1" w:unhideWhenUsed="1"/>
+    <w:lsdException w:name="index 3" w:semiHidden="1" w:unhideWhenUsed="1"/>
+    <w:lsdException w:name="index 4" w:semiHidden="1" w:unhideWhenUsed="1"/>
+    <w:lsdException w:name="index 5" w:semiHidden="1" w:unhideWhenUsed="1"/>
+    <w:lsdException w:name="index 6" w:semiHidden="1" w:unhideWhenUsed="1"/>
+    <w:lsdException w:name="index 7" w:semiHidden="1" w:unhideWhenUsed="1"/>
+    <w:lsdException w:name="index 8" w:semiHidden="1" w:unhideWhenUsed="1"/>
+    <w:lsdException w:name="index 9" w:semiHidden="1" w:unhideWhenUsed="1"/>
+    <w:lsdException w:name="toc 1" w:semiHidden="1" w:uiPriority="39" w:unhideWhenUsed="1"/>
+    <w:lsdException w:name="toc 2" w:semiHidden="1" w:uiPriority="39" w:unhideWhenUsed="1"/>
+    <w:lsdException w:name="toc 3" w:semiHidden="1" w:uiPriority="39" w:unhideWhenUsed="1"/>
+    <w:lsdException w:name="toc 4" w:semiHidden="1" w:uiPriority="39" w:unhideWhenUsed="1"/>
+    <w:lsdException w:name="toc 5" w:semiHidden="1" w:uiPriority="39" w:unhideWhenUsed="1"/>
+    <w:lsdException w:name="toc 6" w:semiHidden="1" w:uiPriority="39" w:unhideWhenUsed="1"/>
+    <w:lsdException w:name="toc 7" w:semiHidden="1" w:uiPriority="39" w:unhideWhenUsed="1"/>
+    <w:lsdException w:name="toc 8" w:semiHidden="1" w:uiPriority="39" w:unhideWhenUsed="1"/>
+    <w:lsdException w:name="toc 9" w:semiHidden="1" w:uiPriority="39" w:unhideWhenUsed="1"/>
+    <w:lsdException w:name="Normal Indent" w:semiHidden="1" w:unhideWhenUsed="1"/>
+    <w:lsdException w:name="footnote text" w:semiHidden="1" w:unhideWhenUsed="1"/>
+    <w:lsdException w:name="annotation text" w:semiHidden="1" w:unhideWhenUsed="1"/>
+    <w:lsdException w:name="header" w:semiHidden="1" w:unhideWhenUsed="1"/>
+    <w:lsdException w:name="footer" w:semiHidden="1" w:unhideWhenUsed="1"/>
+    <w:lsdException w:name="index heading" w:semiHidden="1" w:unhideWhenUsed="1"/>
+    <w:lsdException w:name="caption" w:semiHidden="1" w:uiPriority="35" w:unhideWhenUsed="1" w:qFormat="1"/>
+    <w:lsdException w:name="table of figures" w:semiHidden="1" w:unhideWhenUsed="1"/>
+    <w:lsdException w:name="envelope address" w:semiHidden="1" w:unhideWhenUsed="1"/>
+    <w:lsdException w:name="envelope return" w:semiHidden="1" w:unhideWhenUsed="1"/>
+    <w:lsdException w:name="footnote reference" w:semiHidden="1" w:unhideWhenUsed="1"/>
+    <w:lsdException w:name="annotation reference" w:semiHidden="1" w:unhideWhenUsed="1"/>
+    <w:lsdException w:name="line number" w:semiHidden="1" w:unhideWhenUsed="1"/>
+    <w:lsdException w:name="page number" w:semiHidden="1" w:unhideWhenUsed="1"/>
+    <w:lsdException w:name="endnote reference" w:semiHidden="1" w:unhideWhenUsed="1"/>
+    <w:lsdException w:name="endnote text" w:semiHidden="1" w:unhideWhenUsed="1"/>
+    <w:lsdException w:name="table of authorities" w:semiHidden="1" w:unhideWhenUsed="1"/>
+    <w:lsdException w:name="macro" w:semiHidden="1" w:unhideWhenUsed="1"/>
+    <w:lsdException w:name="toa heading" w:semiHidden="1" w:unhideWhenUsed="1"/>
+    <w:lsdException w:name="List" w:semiHidden="1" w:unhideWhenUsed="1"/>
+    <w:lsdException w:name="List Bullet" w:semiHidden="1" w:unhideWhenUsed="1"/>
+    <w:lsdException w:name="List Number" w:semiHidden="1" w:unhideWhenUsed="1"/>
+    <w:lsdException w:name="List 2" w:semiHidden="1" w:unhideWhenUsed="1"/>
+    <w:lsdException w:name="List 3" w:semiHidden="1" w:unhideWhenUsed="1"/>
+    <w:lsdException w:name="List 4" w:semiHidden="1" w:unhideWhenUsed="1"/>
+    <w:lsdException w:name="List 5" w:semiHidden="1" w:unhideWhenUsed="1"/>
+    <w:lsdException w:name="List Bullet 2" w:semiHidden="1" w:unhideWhenUsed="1"/>
+    <w:lsdException w:name="List Bullet 3" w:semiHidden="1" w:unhideWhenUsed="1"/>
+    <w:lsdException w:name="List Bullet 4" w:semiHidden="1" w:unhideWhenUsed="1"/>
+    <w:lsdException w:name="List Bullet 5" w:semiHidden="1" w:unhideWhenUsed="1"/>
+    <w:lsdException w:name="List Number 2" w:semiHidden="1" w:unhideWhenUsed="1"/>
+    <w:lsdException w:name="List Number 3" w:semiHidden="1" w:unhideWhenUsed="1"/>
+    <w:lsdException w:name="List Number 4" w:semiHidden="1" w:unhideWhenUsed="1"/>
+    <w:lsdException w:name="List Number 5" w:semiHidden="1" w:unhideWhenUsed="1"/>
+    <w:lsdException w:name="Title" w:uiPriority="10" w:qFormat="1"/>
+    <w:lsdException w:name="Closing" w:semiHidden="1" w:unhideWhenUsed="1"/>
+    <w:lsdException w:name="Signature" w:semiHidden="1" w:unhideWhenUsed="1"/>
+    <w:lsdException w:name="Default Paragraph Font" w:semiHidden="1" w:uiPriority="1" w:unhideWhenUsed="1"/>
+    <w:lsdException w:name="Body Text" w:semiHidden="1" w:unhideWhenUsed="1"/>
+    <w:lsdException w:name="Body Text Indent" w:semiHidden="1" w:unhideWhenUsed="1"/>
+    <w:lsdException w:name="List Continue" w:semiHidden="1" w:unhideWhenUsed="1"/>
+    <w:lsdException w:name="List Continue 2" w:semiHidden="1" w:unhideWhenUsed="1"/>
+    <w:lsdException w:name="List Continue 3" w:semiHidden="1" w:unhideWhenUsed="1"/>
+    <w:lsdException w:name="List Continue 4" w:semiHidden="1" w:unhideWhenUsed="1"/>
+    <w:lsdException w:name="List Continue 5" w:semiHidden="1" w:unhideWhenUsed="1"/>
+    <w:lsdException w:name="Message Header" w:semiHidden="1" w:unhideWhenUsed="1"/>
+    <w:lsdException w:name="Subtitle" w:uiPriority="11" w:qFormat="1"/>
+    <w:lsdException w:name="Salutation" w:semiHidden="1" w:unhideWhenUsed="1"/>
+    <w:lsdException w:name="Date" w:semiHidden="1" w:unhideWhenUsed="1"/>
+    <w:lsdException w:name="Body Text First Indent" w:semiHidden="1" w:unhideWhenUsed="1"/>
+    <w:lsdException w:name="Body Text First Indent 2" w:semiHidden="1" w:unhideWhenUsed="1"/>
+    <w:lsdException w:name="Note Heading" w:semiHidden="1" w:unhideWhenUsed="1"/>
+    <w:lsdException w:name="Body Text 2" w:semiHidden="1" w:unhideWhenUsed="1"/>
+    <w:lsdException w:name="Body Text 3" w:semiHidden="1" w:unhideWhenUsed="1"/>
+    <w:lsdException w:name="Body Text Indent 2" w:semiHidden="1" w:unhideWhenUsed="1"/>
+    <w:lsdException w:name="Body Text Indent 3" w:semiHidden="1" w:unhideWhenUsed="1"/>
+    <w:lsdException w:name="Block Text" w:semiHidden="1" w:unhideWhenUsed="1"/>
+    <w:lsdException w:name="Hyperlink" w:semiHidden="1" w:unhideWhenUsed="1"/>
+    <w:lsdException w:name="FollowedHyperlink" w:semiHidden="1" w:unhideWhenUsed="1"/>
+    <w:lsdException w:name="Strong" w:uiPriority="22" w:qFormat="1"/>
+    <w:lsdException w:name="Emphasis" w:uiPriority="20" w:qFormat="1"/>
+    <w:lsdException w:name="Document Map" w:semiHidden="1" w:unhideWhenUsed="1"/>
+    <w:lsdException w:name="Plain Text" w:semiHidden="1" w:unhideWhenUsed="1"/>
+    <w:lsdException w:name="E-mail Signature" w:semiHidden="1" w:unhideWhenUsed="1"/>
+    <w:lsdException w:name="HTML Top of Form" w:semiHidden="1" w:unhideWhenUsed="1"/>
+    <w:lsdException w:name="HTML Bottom of Form" w:semiHidden="1" w:unhideWhenUsed="1"/>
+    <w:lsdException w:name="Normal (Web)" w:semiHidden="1" w:unhideWhenUsed="1"/>
+    <w:lsdException w:name="HTML Acronym" w:semiHidden="1" w:unhideWhenUsed="1"/>
+    <w:lsdException w:name="HTML Address" w:semiHidden="1" w:unhideWhenUsed="1"/>
+    <w:lsdException w:name="HTML Cite" w:semiHidden="1" w:unhideWhenUsed="1"/>
+    <w:lsdException w:name="HTML Code" w:semiHidden="1" w:unhideWhenUsed="1"/>
+    <w:lsdException w:name="HTML Definition" w:semiHidden="1" w:unhideWhenUsed="1"/>
+    <w:lsdException w:name="HTML Keyboard" w:semiHidden="1" w:unhideWhenUsed="1"/>
+    <w:lsdException w:name="HTML Preformatted" w:semiHidden="1" w:unhideWhenUsed="1"/>
+    <w:lsdException w:name="HTML Sample" w:semiHidden="1" w:unhideWhenUsed="1"/>
+    <w:lsdException w:name="HTML Typewriter" w:semiHidden="1" w:unhideWhenUsed="1"/>
+    <w:lsdException w:name="HTML Variable" w:semiHidden="1" w:unhideWhenUsed="1"/>
+    <w:lsdException w:name="Normal Table" w:semiHidden="1" w:unhideWhenUsed="1"/>
+    <w:lsdException w:name="annotation subject" w:semiHidden="1" w:unhideWhenUsed="1"/>
+    <w:lsdException w:name="No List" w:semiHidden="1" w:unhideWhenUsed="1"/>
+    <w:lsdException w:name="Outline List 1" w:semiHidden="1" w:unhideWhenUsed="1"/>
+    <w:lsdException w:name="Outline List 2" w:semiHidden="1" w:unhideWhenUsed="1"/>
+    <w:lsdException w:name="Outline List 3" w:semiHidden="1" w:unhideWhenUsed="1"/>
+    <w:lsdException w:name="Table Simple 1" w:semiHidden="1" w:unhideWhenUsed="1"/>
+    <w:lsdException w:name="Table Simple 2" w:semiHidden="1" w:unhideWhenUsed="1"/>
+    <w:lsdException w:name="Table Simple 3" w:semiHidden="1" w:unhideWhenUsed="1"/>
+    <w:lsdException w:name="Table Classic 1" w:semiHidden="1" w:unhideWhenUsed="1"/>
+    <w:lsdException w:name="Table Classic 2" w:semiHidden="1" w:unhideWhenUsed="1"/>
+    <w:lsdException w:name="Table Classic 3" w:semiHidden="1" w:unhideWhenUsed="1"/>
+    <w:lsdException w:name="Table Classic 4" w:semiHidden="1" w:unhideWhenUsed="1"/>
+    <w:lsdException w:name="Table Colorful 1" w:semiHidden="1" w:unhideWhenUsed="1"/>
+    <w:lsdException w:name="Table Colorful 2" w:semiHidden="1" w:unhideWhenUsed="1"/>
+    <w:lsdException w:name="Table Colorful 3" w:semiHidden="1" w:unhideWhenUsed="1"/>
+    <w:lsdException w:name="Table Columns 1" w:semiHidden="1" w:unhideWhenUsed="1"/>
+    <w:lsdException w:name="Table Columns 2" w:semiHidden="1" w:unhideWhenUsed="1"/>
+    <w:lsdException w:name="Table Columns 3" w:semiHidden="1" w:unhideWhenUsed="1"/>
+    <w:lsdException w:name="Table Columns 4" w:semiHidden="1" w:unhideWhenUsed="1"/>
+    <w:lsdException w:name="Table Columns 5" w:semiHidden="1" w:unhideWhenUsed="1"/>
+    <w:lsdException w:name="Table Grid 1" w:semiHidden="1" w:unhideWhenUsed="1"/>
+    <w:lsdException w:name="Table Grid 2" w:semiHidden="1" w:unhideWhenUsed="1"/>
+    <w:lsdException w:name="Table Grid 3" w:semiHidden="1" w:unhideWhenUsed="1"/>
+    <w:lsdException w:name="Table Grid 4" w:semiHidden="1" w:unhideWhenUsed="1"/>
+    <w:lsdException w:name="Table Grid 5" w:semiHidden="1" w:unhideWhenUsed="1"/>
+    <w:lsdException w:name="Table Grid 6" w:semiHidden="1" w:unhideWhenUsed="1"/>
+    <w:lsdException w:name="Table Grid 7" w:semiHidden="1" w:unhideWhenUsed="1"/>
+    <w:lsdException w:name="Table Grid 8" w:semiHidden="1" w:unhideWhenUsed="1"/>
+    <w:lsdException w:name="Table List 1" w:semiHidden="1" w:unhideWhenUsed="1"/>
+    <w:lsdException w:name="Table List 2" w:semiHidden="1" w:unhideWhenUsed="1"/>
+    <w:lsdException w:name="Table List 3" w:semiHidden="1" w:unhideWhenUsed="1"/>
+    <w:lsdException w:name="Table List 4" w:semiHidden="1" w:unhideWhenUsed="1"/>
+    <w:lsdException w:name="Table List 5" w:semiHidden="1" w:unhideWhenUsed="1"/>
+    <w:lsdException w:name="Table List 6" w:semiHidden="1" w:unhideWhenUsed="1"/>
+    <w:lsdException w:name="Table List 7" w:semiHidden="1" w:unhideWhenUsed="1"/>
+    <w:lsdException w:name="Table List 8" w:semiHidden="1" w:unhideWhenUsed="1"/>
+    <w:lsdException w:name="Table 3D effects 1" w:semiHidden="1" w:unhideWhenUsed="1"/>
+    <w:lsdException w:name="Table 3D effects 2" w:semiHidden="1" w:unhideWhenUsed="1"/>
+    <w:lsdException w:name="Table 3D effects 3" w:semiHidden="1" w:unhideWhenUsed="1"/>
+    <w:lsdException w:name="Table Contemporary" w:semiHidden="1" w:unhideWhenUsed="1"/>
+    <w:lsdException w:name="Table Elegant" w:semiHidden="1" w:unhideWhenUsed="1"/>
+    <w:lsdException w:name="Table Professional" w:semiHidden="1" w:unhideWhenUsed="1"/>
+    <w:lsdException w:name="Table Subtle 1" w:semiHidden="1" w:unhideWhenUsed="1"/>
+    <w:lsdException w:name="Table Subtle 2" w:semiHidden="1" w:unhideWhenUsed="1"/>
+    <w:lsdException w:name="Table Web 1" w:semiHidden="1" w:unhideWhenUsed="1"/>
+    <w:lsdException w:name="Table Web 2" w:semiHidden="1" w:unhideWhenUsed="1"/>
+    <w:lsdException w:name="Table Web 3" w:semiHidden="1" w:unhideWhenUsed="1"/>
+    <w:lsdException w:name="Balloon Text" w:semiHidden="1" w:unhideWhenUsed="1"/>
+    <w:lsdException w:name="Table Grid" w:uiPriority="39"/>
+    <w:lsdException w:name="Table Theme" w:semiHidden="1" w:unhideWhenUsed="1"/>
+    <w:lsdException w:name="Placeholder Text" w:semiHidden="1"/>
+    <w:lsdException w:name="No Spacing" w:uiPriority="1" w:qFormat="1"/>
+    <w:lsdException w:name="Light Shading" w:uiPriority="60"/>
+    <w:lsdException w:name="Light List" w:uiPriority="61"/>
+    <w:lsdException w:name="Light Grid" w:uiPriority="62"/>
+    <w:lsdException w:name="Medium Shading 1" w:uiPriority="63"/>
+    <w:lsdException w:name="Medium Shading 2" w:uiPriority="64"/>
+    <w:lsdException w:name="Medium List 1" w:uiPriority="65"/>
+    <w:lsdException w:name="Medium List 2" w:uiPriority="66"/>
+    <w:lsdException w:name="Medium Grid 1" w:uiPriority="67"/>
+    <w:lsdException w:name="Medium Grid 2" w:uiPriority="68"/>
+    <w:lsdException w:name="Medium Grid 3" w:uiPriority="69"/>
+    <w:lsdException w:name="Dark List" w:uiPriority="70"/>
+    <w:lsdException w:name="Colorful Shading" w:uiPriority="71"/>
+    <w:lsdException w:name="Colorful List" w:uiPriority="72"/>
+    <w:lsdException w:name="Colorful Grid" w:uiPriority="73"/>
+    <w:lsdException w:name="Light Shading Accent 1" w:uiPriority="60"/>
+    <w:lsdException w:name="Light List Accent 1" w:uiPriority="61"/>
+    <w:lsdException w:name="Light Grid Accent 1" w:uiPriority="62"/>
+    <w:lsdException w:name="Medium Shading 1 Accent 1" w:uiPriority="63"/>
+    <w:lsdException w:name="Medium Shading 2 Accent 1" w:uiPriority="64"/>
+    <w:lsdException w:name="Medium List 1 Accent 1" w:uiPriority="65"/>
+    <w:lsdException w:name="Revision" w:semiHidden="1"/>
+    <w:lsdException w:name="List Paragraph" w:uiPriority="34" w:qFormat="1"/>
+    <w:lsdException w:name="Quote" w:uiPriority="29" w:qFormat="1"/>
+    <w:lsdException w:name="Intense Quote" w:uiPriority="30" w:qFormat="1"/>
+    <w:lsdException w:name="Medium List 2 Accent 1" w:uiPriority="66"/>
+    <w:lsdException w:name="Medium Grid 1 Accent 1" w:uiPriority="67"/>
+    <w:lsdException w:name="Medium Grid 2 Accent 1" w:uiPriority="68"/>
+    <w:lsdException w:name="Medium Grid 3 Accent 1" w:uiPriority="69"/>
+    <w:lsdException w:name="Dark List Accent 1" w:uiPriority="70"/>
+    <w:lsdException w:name="Colorful Shading Accent 1" w:uiPriority="71"/>
+    <w:lsdException w:name="Colorful List Accent 1" w:uiPriority="72"/>
+    <w:lsdException w:name="Colorful Grid Accent 1" w:uiPriority="73"/>
+    <w:lsdException w:name="Light Shading Accent 2" w:uiPriority="60"/>
+    <w:lsdException w:name="Light List Accent 2" w:uiPriority="61"/>
+    <w:lsdException w:name="Light Grid Accent 2" w:uiPriority="62"/>
+    <w:lsdException w:name="Medium Shading 1 Accent 2" w:uiPriority="63"/>
+    <w:lsdException w:name="Medium Shading 2 Accent 2" w:uiPriority="64"/>
+    <w:lsdException w:name="Medium List 1 Accent 2" w:uiPriority="65"/>
+    <w:lsdException w:name="Medium List 2 Accent 2" w:uiPriority="66"/>
+    <w:lsdException w:name="Medium Grid 1 Accent 2" w:uiPriority="67"/>
+    <w:lsdException w:name="Medium Grid 2 Accent 2" w:uiPriority="68"/>
+    <w:lsdException w:name="Medium Grid 3 Accent 2" w:uiPriority="69"/>
+    <w:lsdException w:name="Dark List Accent 2" w:uiPriority="70"/>
+    <w:lsdException w:name="Colorful Shading Accent 2" w:uiPriority="71"/>
+    <w:lsdException w:name="Colorful List Accent 2" w:uiPriority="72"/>
+    <w:lsdException w:name="Colorful Grid Accent 2" w:uiPriority="73"/>
+    <w:lsdException w:name="Light Shading Accent 3" w:uiPriority="60"/>
+    <w:lsdException w:name="Light List Accent 3" w:uiPriority="61"/>
+    <w:lsdException w:name="Light Grid Accent 3" w:uiPriority="62"/>
+    <w:lsdException w:name="Medium Shading 1 Accent 3" w:uiPriority="63"/>
+    <w:lsdException w:name="Medium Shading 2 Accent 3" w:uiPriority="64"/>
+    <w:lsdException w:name="Medium List 1 Accent 3" w:uiPriority="65"/>
+    <w:lsdException w:name="Medium List 2 Accent 3" w:uiPriority="66"/>
+    <w:lsdException w:name="Medium Grid 1 Accent 3" w:uiPriority="67"/>
+    <w:lsdException w:name="Medium Grid 2 Accent 3" w:uiPriority="68"/>
+    <w:lsdException w:name="Medium Grid 3 Accent 3" w:uiPriority="69"/>
+    <w:lsdException w:name="Dark List Accent 3" w:uiPriority="70"/>
+    <w:lsdException w:name="Colorful Shading Accent 3" w:uiPriority="71"/>
+    <w:lsdException w:name="Colorful List Accent 3" w:uiPriority="72"/>
+    <w:lsdException w:name="Colorful Grid Accent 3" w:uiPriority="73"/>
+    <w:lsdException w:name="Light Shading Accent 4" w:uiPriority="60"/>
+    <w:lsdException w:name="Light List Accent 4" w:uiPriority="61"/>
+    <w:lsdException w:name="Light Grid Accent 4" w:uiPriority="62"/>
+    <w:lsdException w:name="Medium Shading 1 Accent 4" w:uiPriority="63"/>
+    <w:lsdException w:name="Medium Shading 2 Accent 4" w:uiPriority="64"/>
+    <w:lsdException w:name="Medium List 1 Accent 4" w:uiPriority="65"/>
+    <w:lsdException w:name="Medium List 2 Accent 4" w:uiPriority="66"/>
+    <w:lsdException w:name="Medium Grid 1 Accent 4" w:uiPriority="67"/>
+    <w:lsdException w:name="Medium Grid 2 Accent 4" w:uiPriority="68"/>
+    <w:lsdException w:name="Medium Grid 3 Accent 4" w:uiPriority="69"/>
+    <w:lsdException w:name="Dark List Accent 4" w:uiPriority="70"/>
+    <w:lsdException w:name="Colorful Shading Accent 4" w:uiPriority="71"/>
+    <w:lsdException w:name="Colorful List Accent 4" w:uiPriority="72"/>
+    <w:lsdException w:name="Colorful Grid Accent 4" w:uiPriority="73"/>
+    <w:lsdException w:name="Light Shading Accent 5" w:uiPriority="60"/>
+    <w:lsdException w:name="Light List Accent 5" w:uiPriority="61"/>
+    <w:lsdException w:name="Light Grid Accent 5" w:uiPriority="62"/>
+    <w:lsdException w:name="Medium Shading 1 Accent 5" w:uiPriority="63"/>
+    <w:lsdException w:name="Medium Shading 2 Accent 5" w:uiPriority="64"/>
+    <w:lsdException w:name="Medium List 1 Accent 5" w:uiPriority="65"/>
+    <w:lsdException w:name="Medium List 2 Accent 5" w:uiPriority="66"/>
+    <w:lsdException w:name="Medium Grid 1 Accent 5" w:uiPriority="67"/>
+    <w:lsdException w:name="Medium Grid 2 Accent 5" w:uiPriority="68"/>
+    <w:lsdException w:name="Medium Grid 3 Accent 5" w:uiPriority="69"/>
+    <w:lsdException w:name="Dark List Accent 5" w:uiPriority="70"/>
+    <w:lsdException w:name="Colorful Shading Accent 5" w:uiPriority="71"/>
+    <w:lsdException w:name="Colorful List Accent 5" w:uiPriority="72"/>
+    <w:lsdException w:name="Colorful Grid Accent 5" w:uiPriority="73"/>
+    <w:lsdException w:name="Light Shading Accent 6" w:uiPriority="60"/>
+    <w:lsdException w:name="Light List Accent 6" w:uiPriority="61"/>
+    <w:lsdException w:name="Light Grid Accent 6" w:uiPriority="62"/>
+    <w:lsdException w:name="Medium Shading 1 Accent 6" w:uiPriority="63"/>
+    <w:lsdException w:name="Medium Shading 2 Accent 6" w:uiPriority="64"/>
+    <w:lsdException w:name="Medium List 1 Accent 6" w:uiPriority="65"/>
+    <w:lsdException w:name="Medium List 2 Accent 6" w:uiPriority="66"/>
+    <w:lsdException w:name="Medium Grid 1 Accent 6" w:uiPriority="67"/>
+    <w:lsdException w:name="Medium Grid 2 Accent 6" w:uiPriority="68"/>
+    <w:lsdException w:name="Medium Grid 3 Accent 6" w:uiPriority="69"/>
+    <w:lsdException w:name="Dark List Accent 6" w:uiPriority="70"/>
+    <w:lsdException w:name="Colorful Shading Accent 6" w:uiPriority="71"/>
+    <w:lsdException w:name="Colorful List Accent 6" w:uiPriority="72"/>
+    <w:lsdException w:name="Colorful Grid Accent 6" w:uiPriority="73"/>
+    <w:lsdException w:name="Subtle Emphasis" w:uiPriority="19" w:qFormat="1"/>
+    <w:lsdException w:name="Intense Emphasis" w:uiPriority="21" w:qFormat="1"/>
+    <w:lsdException w:name="Subtle Reference" w:uiPriority="31" w:qFormat="1"/>
+    <w:lsdException w:name="Intense Reference" w:uiPriority="32" w:qFormat="1"/>
+    <w:lsdException w:name="Book Title" w:uiPriority="33" w:qFormat="1"/>
+    <w:lsdException w:name="Bibliography" w:semiHidden="1" w:uiPriority="37" w:unhideWhenUsed="1"/>
+    <w:lsdException w:name="TOC Heading" w:semiHidden="1" w:uiPriority="39" w:unhideWhenUsed="1" w:qFormat="1"/>
+    <w:lsdException w:name="Plain Table 1" w:uiPriority="41"/>
+    <w:lsdException w:name="Plain Table 2" w:uiPriority="42"/>
+    <w:lsdException w:name="Plain Table 3" w:uiPriority="43"/>
+    <w:lsdException w:name="Plain Table 4" w:uiPriority="44"/>
+    <w:lsdException w:name="Plain Table 5" w:uiPriority="45"/>
+    <w:lsdException w:name="Grid Table Light" w:uiPriority="40"/>
+    <w:lsdException w:name="Grid Table 1 Light" w:uiPriority="46"/>
+    <w:lsdException w:name="Grid Table 2" w:uiPriority="47"/>
+    <w:lsdException w:name="Grid Table 3" w:uiPriority="48"/>
+    <w:lsdException w:name="Grid Table 4" w:uiPriority="49"/>
+    <w:lsdException w:name="Grid Table 5 Dark" w:uiPriority="50"/>
+    <w:lsdException w:name="Grid Table 6 Colorful" w:uiPriority="51"/>
+    <w:lsdException w:name="Grid Table 7 Colorful" w:uiPriority="52"/>
+    <w:lsdException w:name="Grid Table 1 Light Accent 1" w:uiPriority="46"/>
+    <w:lsdException w:name="Grid Table 2 Accent 1" w:uiPriority="47"/>
+    <w:lsdException w:name="Grid Table 3 Accent 1" w:uiPriority="48"/>
+    <w:lsdException w:name="Grid Table 4 Accent 1" w:uiPriority="49"/>
+    <w:lsdException w:name="Grid Table 5 Dark Accent 1" w:uiPriority="50"/>
+    <w:lsdException w:name="Grid Table 6 Colorful Accent 1" w:uiPriority="51"/>
+    <w:lsdException w:name="Grid Table 7 Colorful Accent 1" w:uiPriority="52"/>
+    <w:lsdException w:name="Grid Table 1 Light Accent 2" w:uiPriority="46"/>
+    <w:lsdException w:name="Grid Table 2 Accent 2" w:uiPriority="47"/>
+    <w:lsdException w:name="Grid Table 3 Accent 2" w:uiPriority="48"/>
+    <w:lsdException w:name="Grid Table 4 Accent 2" w:uiPriority="49"/>
+    <w:lsdException w:name="Grid Table 5 Dark Accent 2" w:uiPriority="50"/>
+    <w:lsdException w:name="Grid Table 6 Colorful Accent 2" w:uiPriority="51"/>
+    <w:lsdException w:name="Grid Table 7 Colorful Accent 2" w:uiPriority="52"/>
+    <w:lsdException w:name="Grid Table 1 Light Accent 3" w:uiPriority="46"/>
+    <w:lsdException w:name="Grid Table 2 Accent 3" w:uiPriority="47"/>
+    <w:lsdException w:name="Grid Table 3 Accent 3" w:uiPriority="48"/>
+    <w:lsdException w:name="Grid Table 4 Accent 3" w:uiPriority="49"/>
+    <w:lsdException w:name="Grid Table 5 Dark Accent 3" w:uiPriority="50"/>
+    <w:lsdException w:name="Grid Table 6 Colorful Accent 3" w:uiPriority="51"/>
+    <w:lsdException w:name="Grid Table 7 Colorful Accent 3" w:uiPriority="52"/>
+    <w:lsdException w:name="Grid Table 1 Light Accent 4" w:uiPriority="46"/>
+    <w:lsdException w:name="Grid Table 2 Accent 4" w:uiPriority="47"/>
+    <w:lsdException w:name="Grid Table 3 Accent 4" w:uiPriority="48"/>
+    <w:lsdException w:name="Grid Table 4 Accent 4" w:uiPriority="49"/>
+    <w:lsdException w:name="Grid Table 5 Dark Accent 4" w:uiPriority="50"/>
+    <w:lsdException w:name="Grid Table 6 Colorful Accent 4" w:uiPriority="51"/>
+    <w:lsdException w:name="Grid Table 7 Colorful Accent 4" w:uiPriority="52"/>
+    <w:lsdException w:name="Grid Table 1 Light Accent 5" w:uiPriority="46"/>
+    <w:lsdException w:name="Grid Table 2 Accent 5" w:uiPriority="47"/>
+    <w:lsdException w:name="Grid Table 3 Accent 5" w:uiPriority="48"/>
+    <w:lsdException w:name="Grid Table 4 Accent 5" w:uiPriority="49"/>
+    <w:lsdException w:name="Grid Table 5 Dark Accent 5" w:uiPriority="50"/>
+    <w:lsdException w:name="Grid Table 6 Colorful Accent 5" w:uiPriority="51"/>
+    <w:lsdException w:name="Grid Table 7 Colorful Accent 5" w:uiPriority="52"/>
+    <w:lsdException w:name="Grid Table 1 Light Accent 6" w:uiPriority="46"/>
+    <w:lsdException w:name="Grid Table 2 Accent 6" w:uiPriority="47"/>
+    <w:lsdException w:name="Grid Table 3 Accent 6" w:uiPriority="48"/>
+    <w:lsdException w:name="Grid Table 4 Accent 6" w:uiPriority="49"/>
+    <w:lsdException w:name="Grid Table 5 Dark Accent 6" w:uiPriority="50"/>
+    <w:lsdException w:name="Grid Table 6 Colorful Accent 6" w:uiPriority="51"/>
+    <w:lsdException w:name="Grid Table 7 Colorful Accent 6" w:uiPriority="52"/>
+    <w:lsdException w:name="List Table 1 Light" w:uiPriority="46"/>
+    <w:lsdException w:name="List Table 2" w:uiPriority="47"/>
+    <w:lsdException w:name="List Table 3" w:uiPriority="48"/>
+    <w:lsdException w:name="List Table 4" w:uiPriority="49"/>
+    <w:lsdException w:name="List Table 5 Dark" w:uiPriority="50"/>
+    <w:lsdException w:name="List Table 6 Colorful" w:uiPriority="51"/>
+    <w:lsdException w:name="List Table 7 Colorful" w:uiPriority="52"/>
+    <w:lsdException w:name="List Table 1 Light Accent 1" w:uiPriority="46"/>
+    <w:lsdException w:name="List Table 2 Accent 1" w:uiPriority="47"/>
+    <w:lsdException w:name="List Table 3 Accent 1" w:uiPriority="48"/>
+    <w:lsdException w:name="List Table 4 Accent 1" w:uiPriority="49"/>
+    <w:lsdException w:name="List Table 5 Dark Accent 1" w:uiPriority="50"/>
+    <w:lsdException w:name="List Table 6 Colorful Accent 1" w:uiPriority="51"/>
+    <w:lsdException w:name="List Table 7 Colorful Accent 1" w:uiPriority="52"/>
+    <w:lsdException w:name="List Table 1 Light Accent 2" w:uiPriority="46"/>
+    <w:lsdException w:name="List Table 2 Accent 2" w:uiPriority="47"/>
+    <w:lsdException w:name="List Table 3 Accent 2" w:uiPriority="48"/>
+    <w:lsdException w:name="List Table 4 Accent 2" w:uiPriority="49"/>
+    <w:lsdException w:name="List Table 5 Dark Accent 2" w:uiPriority="50"/>
+    <w:lsdException w:name="List Table 6 Colorful Accent 2" w:uiPriority="51"/>
+    <w:lsdException w:name="List Table 7 Colorful Accent 2" w:uiPriority="52"/>
+    <w:lsdException w:name="List Table 1 Light Accent 3" w:uiPriority="46"/>
+    <w:lsdException w:name="List Table 2 Accent 3" w:uiPriority="47"/>
+    <w:lsdException w:name="List Table 3 Accent 3" w:uiPriority="48"/>
+    <w:lsdException w:name="List Table 4 Accent 3" w:uiPriority="49"/>
+    <w:lsdException w:name="List Table 5 Dark Accent 3" w:uiPriority="50"/>
+    <w:lsdException w:name="List Table 6 Colorful Accent 3" w:uiPriority="51"/>
+    <w:lsdException w:name="List Table 7 Colorful Accent 3" w:uiPriority="52"/>
+    <w:lsdException w:name="List Table 1 Light Accent 4" w:uiPriority="46"/>
+    <w:lsdException w:name="List Table 2 Accent 4" w:uiPriority="47"/>
+    <w:lsdException w:name="List Table 3 Accent 4" w:uiPriority="48"/>
+    <w:lsdException w:name="List Table 4 Accent 4" w:uiPriority="49"/>
+    <w:lsdException w:name="List Table 5 Dark Accent 4" w:uiPriority="50"/>
+    <w:lsdException w:name="List Table 6 Colorful Accent 4" w:uiPriority="51"/>
+    <w:lsdException w:name="List Table 7 Colorful Accent 4" w:uiPriority="52"/>
+    <w:lsdException w:name="List Table 1 Light Accent 5" w:uiPriority="46"/>
+    <w:lsdException w:name="List Table 2 Accent 5" w:uiPriority="47"/>
+    <w:lsdException w:name="List Table 3 Accent 5" w:uiPriority="48"/>
+    <w:lsdException w:name="List Table 4 Accent 5" w:uiPriority="49"/>
+    <w:lsdException w:name="List Table 5 Dark Accent 5" w:uiPriority="50"/>
+    <w:lsdException w:name="List Table 6 Colorful Accent 5" w:uiPriority="51"/>
+    <w:lsdException w:name="List Table 7 Colorful Accent 5" w:uiPriority="52"/>
+    <w:lsdException w:name="List Table 1 Light Accent 6" w:uiPriority="46"/>
+    <w:lsdException w:name="List Table 2 Accent 6" w:uiPriority="47"/>
+    <w:lsdException w:name="List Table 3 Accent 6" w:uiPriority="48"/>
+    <w:lsdException w:name="List Table 4 Accent 6" w:uiPriority="49"/>
+    <w:lsdException w:name="List Table 5 Dark Accent 6" w:uiPriority="50"/>
+    <w:lsdException w:name="List Table 6 Colorful Accent 6" w:uiPriority="51"/>
+    <w:lsdException w:name="List Table 7 Colorful Accent 6" w:uiPriority="52"/>
+    <w:lsdException w:name="Mention" w:semiHidden="1" w:unhideWhenUsed="1"/>
+    <w:lsdException w:name="Smart Hyperlink" w:semiHidden="1" w:unhideWhenUsed="1"/>
+    <w:lsdException w:name="Hashtag" w:semiHidden="1" w:unhideWhenUsed="1"/>
+    <w:lsdException w:name="Unresolved Mention" w:semiHidden="1" w:unhideWhenUsed="1"/>
+    <w:lsdException w:name="Smart Link" w:semiHidden="1" w:unhideWhenUsed="1"/>
+  </w:latentStyles>
+  <w:style w:type="paragraph" w:default="1" w:styleId="Normal">
+    <w:name w:val="Normal"/>
+    <w:qFormat/>
+    <w:pPr>
+      <w:spacing w:after="160" w:line="264" w:lineRule="atLeast"/>
+    </w:pPr>
+  </w:style>
+  <w:style w:type="paragraph" w:styleId="Heading1">
+    <w:name w:val="heading 1"/>
     <w:basedOn w:val="Normal"/>
     <w:next w:val="Normal"/>
+    <w:uiPriority w:val="9"/>
     <w:qFormat/>
+    <w:pPr>
+      <w:pBdr>
+        <w:bottom w:val="single" w:sz="6" w:space="4" w:color="000000"/>
+      </w:pBdr>
+      <w:spacing w:before="260" w:after="120"/>
+      <w:outlineLvl w:val="0"/>
+    </w:pPr>
     <w:rPr>
-      <w:sz w:val="56"/>
-      <w:szCs w:val="56"/>
-    </w:rPr>
-  </w:style>
-  <w:style w:type="paragraph" w:styleId="Heading1">
-    <w:name w:val="Heading 1"/>
-    <w:basedOn w:val="Normal"/>
-    <w:next w:val="Normal"/>
-    <w:qFormat/>
-    <w:rPr>
-      <w:color w:val="2E74B5"/>
-      <w:sz w:val="32"/>
-      <w:szCs w:val="32"/>
+      <w:b/>
+      <w:bCs/>
+      <w:caps/>
+      <w:sz w:val="30"/>
+      <w:szCs w:val="30"/>
     </w:rPr>
   </w:style>
   <w:style w:type="paragraph" w:styleId="Heading2">
-    <w:name w:val="Heading 2"/>
+    <w:name w:val="heading 2"/>
     <w:basedOn w:val="Normal"/>
     <w:next w:val="Normal"/>
+    <w:uiPriority w:val="9"/>
+    <w:unhideWhenUsed/>
     <w:qFormat/>
+    <w:pPr>
+      <w:spacing w:before="280" w:after="120"/>
+      <w:outlineLvl w:val="1"/>
+    </w:pPr>
     <w:rPr>
-      <w:color w:val="2E74B5"/>
-      <w:sz w:val="26"/>
-      <w:szCs w:val="26"/>
-    </w:rPr>
-  </w:style>
-  <w:style w:type="paragraph" w:styleId="Heading3">
-    <w:name w:val="Heading 3"/>
-    <w:basedOn w:val="Normal"/>
-    <w:next w:val="Normal"/>
-    <w:qFormat/>
-    <w:rPr>
-      <w:color w:val="1F4D78"/>
+      <w:b/>
+      <w:bCs/>
       <w:sz w:val="24"/>
       <w:szCs w:val="24"/>
     </w:rPr>
   </w:style>
-  <w:style w:type="paragraph" w:styleId="Heading4">
-    <w:name w:val="Heading 4"/>
+  <w:style w:type="paragraph" w:styleId="Heading3">
+    <w:name w:val="heading 3"/>
     <w:basedOn w:val="Normal"/>
     <w:next w:val="Normal"/>
+    <w:uiPriority w:val="9"/>
+    <w:unhideWhenUsed/>
     <w:qFormat/>
+    <w:pPr>
+      <w:spacing w:before="220" w:after="100"/>
+      <w:outlineLvl w:val="2"/>
+    </w:pPr>
+    <w:rPr>
+      <w:b/>
+      <w:bCs/>
+      <w:i/>
+      <w:iCs/>
+    </w:rPr>
+  </w:style>
+  <w:style w:type="paragraph" w:styleId="Heading4">
+    <w:name w:val="heading 4"/>
+    <w:basedOn w:val="Normal"/>
+    <w:next w:val="Normal"/>
+    <w:uiPriority w:val="9"/>
+    <w:semiHidden/>
+    <w:unhideWhenUsed/>
+    <w:qFormat/>
+    <w:pPr>
+      <w:outlineLvl w:val="3"/>
+    </w:pPr>
     <w:rPr>
       <w:i/>
       <w:iCs/>
@@ -1010,25 +1594,81 @@
     </w:rPr>
   </w:style>
   <w:style w:type="paragraph" w:styleId="Heading5">
-    <w:name w:val="Heading 5"/>
+    <w:name w:val="heading 5"/>
     <w:basedOn w:val="Normal"/>
     <w:next w:val="Normal"/>
+    <w:uiPriority w:val="9"/>
+    <w:semiHidden/>
+    <w:unhideWhenUsed/>
     <w:qFormat/>
+    <w:pPr>
+      <w:outlineLvl w:val="4"/>
+    </w:pPr>
     <w:rPr>
       <w:color w:val="2E74B5"/>
     </w:rPr>
   </w:style>
   <w:style w:type="paragraph" w:styleId="Heading6">
-    <w:name w:val="Heading 6"/>
+    <w:name w:val="heading 6"/>
     <w:basedOn w:val="Normal"/>
     <w:next w:val="Normal"/>
+    <w:uiPriority w:val="9"/>
+    <w:semiHidden/>
+    <w:unhideWhenUsed/>
     <w:qFormat/>
+    <w:pPr>
+      <w:outlineLvl w:val="5"/>
+    </w:pPr>
     <w:rPr>
       <w:color w:val="1F4D78"/>
     </w:rPr>
   </w:style>
-  <w:style w:type="paragraph" w:styleId="Strong">
-    <w:name w:val="Strong"/>
+  <w:style w:type="character" w:default="1" w:styleId="DefaultParagraphFont">
+    <w:name w:val="Default Paragraph Font"/>
+    <w:uiPriority w:val="1"/>
+    <w:semiHidden/>
+    <w:unhideWhenUsed/>
+  </w:style>
+  <w:style w:type="table" w:default="1" w:styleId="TableNormal">
+    <w:name w:val="Normal Table"/>
+    <w:uiPriority w:val="99"/>
+    <w:semiHidden/>
+    <w:unhideWhenUsed/>
+    <w:tblPr>
+      <w:tblInd w:w="0" w:type="dxa"/>
+      <w:tblCellMar>
+        <w:top w:w="0" w:type="dxa"/>
+        <w:left w:w="108" w:type="dxa"/>
+        <w:bottom w:w="0" w:type="dxa"/>
+        <w:right w:w="108" w:type="dxa"/>
+      </w:tblCellMar>
+    </w:tblPr>
+  </w:style>
+  <w:style w:type="numbering" w:default="1" w:styleId="NoList">
+    <w:name w:val="No List"/>
+    <w:uiPriority w:val="99"/>
+    <w:semiHidden/>
+    <w:unhideWhenUsed/>
+  </w:style>
+  <w:style w:type="paragraph" w:styleId="Title">
+    <w:name w:val="Title"/>
+    <w:basedOn w:val="Normal"/>
+    <w:next w:val="Normal"/>
+    <w:uiPriority w:val="10"/>
+    <w:qFormat/>
+    <w:pPr>
+      <w:spacing w:after="120"/>
+      <w:jc w:val="center"/>
+    </w:pPr>
+    <w:rPr>
+      <w:b/>
+      <w:bCs/>
+      <w:sz w:val="56"/>
+      <w:szCs w:val="56"/>
+    </w:rPr>
+  </w:style>
+  <w:style w:type="paragraph" w:customStyle="1" w:styleId="Strong1">
+    <w:name w:val="Strong1"/>
     <w:basedOn w:val="Normal"/>
     <w:next w:val="Normal"/>
     <w:qFormat/>
@@ -1044,7 +1684,6 @@
   </w:style>
   <w:style w:type="character" w:styleId="Hyperlink">
     <w:name w:val="Hyperlink"/>
-    <w:basedOn w:val="DefaultParagraphFont"/>
     <w:uiPriority w:val="99"/>
     <w:unhideWhenUsed/>
     <w:rPr>
@@ -1054,7 +1693,6 @@
   </w:style>
   <w:style w:type="character" w:styleId="FootnoteReference">
     <w:name w:val="footnote reference"/>
-    <w:basedOn w:val="DefaultParagraphFont"/>
     <w:uiPriority w:val="99"/>
     <w:semiHidden/>
     <w:unhideWhenUsed/>
@@ -1077,9 +1715,8 @@
       <w:szCs w:val="20"/>
     </w:rPr>
   </w:style>
-  <w:style w:type="character" w:styleId="FootnoteTextChar">
+  <w:style w:type="character" w:customStyle="1" w:styleId="FootnoteTextChar">
     <w:name w:val="Footnote Text Char"/>
-    <w:basedOn w:val="DefaultParagraphFont"/>
     <w:link w:val="FootnoteText"/>
     <w:uiPriority w:val="99"/>
     <w:semiHidden/>
@@ -1091,7 +1728,6 @@
   </w:style>
   <w:style w:type="character" w:styleId="EndnoteReference">
     <w:name w:val="endnote reference"/>
-    <w:basedOn w:val="DefaultParagraphFont"/>
     <w:uiPriority w:val="99"/>
     <w:semiHidden/>
     <w:unhideWhenUsed/>
@@ -1114,9 +1750,8 @@
       <w:szCs w:val="20"/>
     </w:rPr>
   </w:style>
-  <w:style w:type="character" w:styleId="EndnoteTextChar">
+  <w:style w:type="character" w:customStyle="1" w:styleId="EndnoteTextChar">
     <w:name w:val="Endnote Text Char"/>
-    <w:basedOn w:val="DefaultParagraphFont"/>
     <w:link w:val="EndnoteText"/>
     <w:uiPriority w:val="99"/>
     <w:semiHidden/>
@@ -1126,91 +1761,320 @@
       <w:szCs w:val="20"/>
     </w:rPr>
   </w:style>
-  <w:style w:type="paragraph" w:styleId="Title">
-    <w:name w:val="Title"/>
-    <w:basedOn w:val="Normal"/>
-    <w:next w:val="Normal"/>
-    <w:pPr>
-      <w:spacing w:after="120"/>
-      <w:jc w:val="center"/>
-    </w:pPr>
-    <w:rPr>
-      <w:rFonts w:ascii="Courier New" w:cs="Courier New" w:eastAsia="Courier New" w:hAnsi="Courier New"/>
-      <w:b/>
-      <w:bCs/>
-      <w:color w:val="000000"/>
-      <w:sz w:val="56"/>
-      <w:szCs w:val="56"/>
-    </w:rPr>
-  </w:style>
-  <w:style w:type="paragraph" w:styleId="Heading1">
-    <w:name w:val="Heading 1"/>
-    <w:basedOn w:val="Normal"/>
-    <w:next w:val="Normal"/>
-    <w:qFormat/>
-    <w:pPr>
-      <w:pBdr>
-        <w:bottom w:val="single" w:color="000000" w:sz="6" w:space="4"/>
-      </w:pBdr>
-      <w:spacing w:after="120" w:before="260"/>
-    </w:pPr>
-    <w:rPr>
-      <w:rFonts w:ascii="Courier New" w:cs="Courier New" w:eastAsia="Courier New" w:hAnsi="Courier New"/>
-      <w:b/>
-      <w:bCs/>
-      <w:caps/>
-      <w:color w:val="000000"/>
-      <w:sz w:val="30"/>
-      <w:szCs w:val="30"/>
-    </w:rPr>
-  </w:style>
-  <w:style w:type="paragraph" w:styleId="Heading2">
-    <w:name w:val="Heading 2"/>
-    <w:basedOn w:val="Normal"/>
-    <w:next w:val="Normal"/>
-    <w:qFormat/>
-    <w:pPr>
-      <w:spacing w:after="120" w:before="280"/>
-    </w:pPr>
-    <w:rPr>
-      <w:rFonts w:ascii="Courier New" w:cs="Courier New" w:eastAsia="Courier New" w:hAnsi="Courier New"/>
-      <w:b/>
-      <w:bCs/>
-      <w:color w:val="000000"/>
-      <w:sz w:val="24"/>
-      <w:szCs w:val="24"/>
-    </w:rPr>
-  </w:style>
-  <w:style w:type="paragraph" w:styleId="Heading3">
-    <w:name w:val="Heading 3"/>
-    <w:basedOn w:val="Normal"/>
-    <w:next w:val="Normal"/>
-    <w:qFormat/>
-    <w:pPr>
-      <w:spacing w:after="100" w:before="220"/>
-    </w:pPr>
-    <w:rPr>
-      <w:rFonts w:ascii="Courier New" w:cs="Courier New" w:eastAsia="Courier New" w:hAnsi="Courier New"/>
-      <w:b/>
-      <w:bCs/>
-      <w:i/>
-      <w:iCs/>
-      <w:color w:val="000000"/>
-      <w:sz w:val="22"/>
-      <w:szCs w:val="22"/>
-    </w:rPr>
-  </w:style>
-  <w:style w:type="paragraph" w:styleId="Normal">
-    <w:name w:val="Normal"/>
-    <w:pPr>
-      <w:spacing w:after="160" w:line="264" w:lineRule="atLeast"/>
-    </w:pPr>
-    <w:rPr>
-      <w:rFonts w:ascii="Courier New" w:cs="Courier New" w:eastAsia="Courier New" w:hAnsi="Courier New"/>
-      <w:color w:val="000000"/>
-      <w:sz w:val="22"/>
-      <w:szCs w:val="22"/>
-    </w:rPr>
-  </w:style>
 </w:styles>
+</file>
+
+<file path=word/theme/theme1.xml><?xml version="1.0" encoding="utf-8"?>
+<a:theme xmlns:a="http://schemas.openxmlformats.org/drawingml/2006/main" name="Office Theme">
+  <a:themeElements>
+    <a:clrScheme name="Office">
+      <a:dk1>
+        <a:sysClr val="windowText" lastClr="000000"/>
+      </a:dk1>
+      <a:lt1>
+        <a:sysClr val="window" lastClr="FFFFFF"/>
+      </a:lt1>
+      <a:dk2>
+        <a:srgbClr val="0E2841"/>
+      </a:dk2>
+      <a:lt2>
+        <a:srgbClr val="E8E8E8"/>
+      </a:lt2>
+      <a:accent1>
+        <a:srgbClr val="156082"/>
+      </a:accent1>
+      <a:accent2>
+        <a:srgbClr val="E97132"/>
+      </a:accent2>
+      <a:accent3>
+        <a:srgbClr val="196B24"/>
+      </a:accent3>
+      <a:accent4>
+        <a:srgbClr val="0F9ED5"/>
+      </a:accent4>
+      <a:accent5>
+        <a:srgbClr val="A02B93"/>
+      </a:accent5>
+      <a:accent6>
+        <a:srgbClr val="4EA72E"/>
+      </a:accent6>
+      <a:hlink>
+        <a:srgbClr val="467886"/>
+      </a:hlink>
+      <a:folHlink>
+        <a:srgbClr val="96607D"/>
+      </a:folHlink>
+    </a:clrScheme>
+    <a:fontScheme name="Office">
+      <a:majorFont>
+        <a:latin typeface="Aptos Display" panose="02110004020202020204"/>
+        <a:ea typeface=""/>
+        <a:cs typeface=""/>
+        <a:font script="Jpan" typeface="游ゴシック Light"/>
+        <a:font script="Hang" typeface="맑은 고딕"/>
+        <a:font script="Hans" typeface="等线 Light"/>
+        <a:font script="Hant" typeface="新細明體"/>
+        <a:font script="Arab" typeface="Times New Roman"/>
+        <a:font script="Hebr" typeface="Times New Roman"/>
+        <a:font script="Thai" typeface="Angsana New"/>
+        <a:font script="Ethi" typeface="Nyala"/>
+        <a:font script="Beng" typeface="Vrinda"/>
+        <a:font script="Gujr" typeface="Shruti"/>
+        <a:font script="Khmr" typeface="MoolBoran"/>
+        <a:font script="Knda" typeface="Tunga"/>
+        <a:font script="Guru" typeface="Raavi"/>
+        <a:font script="Cans" typeface="Euphemia"/>
+        <a:font script="Cher" typeface="Plantagenet Cherokee"/>
+        <a:font script="Yiii" typeface="Microsoft Yi Baiti"/>
+        <a:font script="Tibt" typeface="Microsoft Himalaya"/>
+        <a:font script="Thaa" typeface="MV Boli"/>
+        <a:font script="Deva" typeface="Mangal"/>
+        <a:font script="Telu" typeface="Gautami"/>
+        <a:font script="Taml" typeface="Latha"/>
+        <a:font script="Syrc" typeface="Estrangelo Edessa"/>
+        <a:font script="Orya" typeface="Kalinga"/>
+        <a:font script="Mlym" typeface="Kartika"/>
+        <a:font script="Laoo" typeface="DokChampa"/>
+        <a:font script="Sinh" typeface="Iskoola Pota"/>
+        <a:font script="Mong" typeface="Mongolian Baiti"/>
+        <a:font script="Viet" typeface="Times New Roman"/>
+        <a:font script="Uigh" typeface="Microsoft Uighur"/>
+        <a:font script="Geor" typeface="Sylfaen"/>
+        <a:font script="Armn" typeface="Arial"/>
+        <a:font script="Bugi" typeface="Leelawadee UI"/>
+        <a:font script="Bopo" typeface="Microsoft JhengHei"/>
+        <a:font script="Java" typeface="Javanese Text"/>
+        <a:font script="Lisu" typeface="Segoe UI"/>
+        <a:font script="Mymr" typeface="Myanmar Text"/>
+        <a:font script="Nkoo" typeface="Ebrima"/>
+        <a:font script="Olck" typeface="Nirmala UI"/>
+        <a:font script="Osma" typeface="Ebrima"/>
+        <a:font script="Phag" typeface="Phagspa"/>
+        <a:font script="Syrn" typeface="Estrangelo Edessa"/>
+        <a:font script="Syrj" typeface="Estrangelo Edessa"/>
+        <a:font script="Syre" typeface="Estrangelo Edessa"/>
+        <a:font script="Sora" typeface="Nirmala UI"/>
+        <a:font script="Tale" typeface="Microsoft Tai Le"/>
+        <a:font script="Talu" typeface="Microsoft New Tai Lue"/>
+        <a:font script="Tfng" typeface="Ebrima"/>
+      </a:majorFont>
+      <a:minorFont>
+        <a:latin typeface="Aptos" panose="02110004020202020204"/>
+        <a:ea typeface=""/>
+        <a:cs typeface=""/>
+        <a:font script="Jpan" typeface="游明朝"/>
+        <a:font script="Hang" typeface="맑은 고딕"/>
+        <a:font script="Hans" typeface="等线"/>
+        <a:font script="Hant" typeface="新細明體"/>
+        <a:font script="Arab" typeface="Arial"/>
+        <a:font script="Hebr" typeface="Arial"/>
+        <a:font script="Thai" typeface="Cordia New"/>
+        <a:font script="Ethi" typeface="Nyala"/>
+        <a:font script="Beng" typeface="Vrinda"/>
+        <a:font script="Gujr" typeface="Shruti"/>
+        <a:font script="Khmr" typeface="DaunPenh"/>
+        <a:font script="Knda" typeface="Tunga"/>
+        <a:font script="Guru" typeface="Raavi"/>
+        <a:font script="Cans" typeface="Euphemia"/>
+        <a:font script="Cher" typeface="Plantagenet Cherokee"/>
+        <a:font script="Yiii" typeface="Microsoft Yi Baiti"/>
+        <a:font script="Tibt" typeface="Microsoft Himalaya"/>
+        <a:font script="Thaa" typeface="MV Boli"/>
+        <a:font script="Deva" typeface="Mangal"/>
+        <a:font script="Telu" typeface="Gautami"/>
+        <a:font script="Taml" typeface="Latha"/>
+        <a:font script="Syrc" typeface="Estrangelo Edessa"/>
+        <a:font script="Orya" typeface="Kalinga"/>
+        <a:font script="Mlym" typeface="Kartika"/>
+        <a:font script="Laoo" typeface="DokChampa"/>
+        <a:font script="Sinh" typeface="Iskoola Pota"/>
+        <a:font script="Mong" typeface="Mongolian Baiti"/>
+        <a:font script="Viet" typeface="Arial"/>
+        <a:font script="Uigh" typeface="Microsoft Uighur"/>
+        <a:font script="Geor" typeface="Sylfaen"/>
+        <a:font script="Armn" typeface="Arial"/>
+        <a:font script="Bugi" typeface="Leelawadee UI"/>
+        <a:font script="Bopo" typeface="Microsoft JhengHei"/>
+        <a:font script="Java" typeface="Javanese Text"/>
+        <a:font script="Lisu" typeface="Segoe UI"/>
+        <a:font script="Mymr" typeface="Myanmar Text"/>
+        <a:font script="Nkoo" typeface="Ebrima"/>
+        <a:font script="Olck" typeface="Nirmala UI"/>
+        <a:font script="Osma" typeface="Ebrima"/>
+        <a:font script="Phag" typeface="Phagspa"/>
+        <a:font script="Syrn" typeface="Estrangelo Edessa"/>
+        <a:font script="Syrj" typeface="Estrangelo Edessa"/>
+        <a:font script="Syre" typeface="Estrangelo Edessa"/>
+        <a:font script="Sora" typeface="Nirmala UI"/>
+        <a:font script="Tale" typeface="Microsoft Tai Le"/>
+        <a:font script="Talu" typeface="Microsoft New Tai Lue"/>
+        <a:font script="Tfng" typeface="Ebrima"/>
+      </a:minorFont>
+    </a:fontScheme>
+    <a:fmtScheme name="Office">
+      <a:fillStyleLst>
+        <a:solidFill>
+          <a:schemeClr val="phClr"/>
+        </a:solidFill>
+        <a:gradFill rotWithShape="1">
+          <a:gsLst>
+            <a:gs pos="0">
+              <a:schemeClr val="phClr">
+                <a:lumMod val="110000"/>
+                <a:satMod val="105000"/>
+                <a:tint val="67000"/>
+              </a:schemeClr>
+            </a:gs>
+            <a:gs pos="50000">
+              <a:schemeClr val="phClr">
+                <a:lumMod val="105000"/>
+                <a:satMod val="103000"/>
+                <a:tint val="73000"/>
+              </a:schemeClr>
+            </a:gs>
+            <a:gs pos="100000">
+              <a:schemeClr val="phClr">
+                <a:lumMod val="105000"/>
+                <a:satMod val="109000"/>
+                <a:tint val="81000"/>
+              </a:schemeClr>
+            </a:gs>
+          </a:gsLst>
+          <a:lin ang="5400000" scaled="0"/>
+        </a:gradFill>
+        <a:gradFill rotWithShape="1">
+          <a:gsLst>
+            <a:gs pos="0">
+              <a:schemeClr val="phClr">
+                <a:satMod val="103000"/>
+                <a:lumMod val="102000"/>
+                <a:tint val="94000"/>
+              </a:schemeClr>
+            </a:gs>
+            <a:gs pos="50000">
+              <a:schemeClr val="phClr">
+                <a:satMod val="110000"/>
+                <a:lumMod val="100000"/>
+                <a:shade val="100000"/>
+              </a:schemeClr>
+            </a:gs>
+            <a:gs pos="100000">
+              <a:schemeClr val="phClr">
+                <a:lumMod val="99000"/>
+                <a:satMod val="120000"/>
+                <a:shade val="78000"/>
+              </a:schemeClr>
+            </a:gs>
+          </a:gsLst>
+          <a:lin ang="5400000" scaled="0"/>
+        </a:gradFill>
+      </a:fillStyleLst>
+      <a:lnStyleLst>
+        <a:ln w="12700" cap="flat" cmpd="sng" algn="ctr">
+          <a:solidFill>
+            <a:schemeClr val="phClr"/>
+          </a:solidFill>
+          <a:prstDash val="solid"/>
+          <a:miter lim="800000"/>
+        </a:ln>
+        <a:ln w="19050" cap="flat" cmpd="sng" algn="ctr">
+          <a:solidFill>
+            <a:schemeClr val="phClr"/>
+          </a:solidFill>
+          <a:prstDash val="solid"/>
+          <a:miter lim="800000"/>
+        </a:ln>
+        <a:ln w="25400" cap="flat" cmpd="sng" algn="ctr">
+          <a:solidFill>
+            <a:schemeClr val="phClr"/>
+          </a:solidFill>
+          <a:prstDash val="solid"/>
+          <a:miter lim="800000"/>
+        </a:ln>
+      </a:lnStyleLst>
+      <a:effectStyleLst>
+        <a:effectStyle>
+          <a:effectLst/>
+        </a:effectStyle>
+        <a:effectStyle>
+          <a:effectLst/>
+        </a:effectStyle>
+        <a:effectStyle>
+          <a:effectLst>
+            <a:outerShdw blurRad="57150" dist="19050" dir="5400000" algn="ctr" rotWithShape="0">
+              <a:srgbClr val="000000">
+                <a:alpha val="63000"/>
+              </a:srgbClr>
+            </a:outerShdw>
+          </a:effectLst>
+        </a:effectStyle>
+      </a:effectStyleLst>
+      <a:bgFillStyleLst>
+        <a:solidFill>
+          <a:schemeClr val="phClr"/>
+        </a:solidFill>
+        <a:solidFill>
+          <a:schemeClr val="phClr">
+            <a:tint val="95000"/>
+            <a:satMod val="170000"/>
+          </a:schemeClr>
+        </a:solidFill>
+        <a:gradFill rotWithShape="1">
+          <a:gsLst>
+            <a:gs pos="0">
+              <a:schemeClr val="phClr">
+                <a:tint val="93000"/>
+                <a:satMod val="150000"/>
+                <a:shade val="98000"/>
+                <a:lumMod val="102000"/>
+              </a:schemeClr>
+            </a:gs>
+            <a:gs pos="50000">
+              <a:schemeClr val="phClr">
+                <a:tint val="98000"/>
+                <a:satMod val="130000"/>
+                <a:shade val="90000"/>
+                <a:lumMod val="103000"/>
+              </a:schemeClr>
+            </a:gs>
+            <a:gs pos="100000">
+              <a:schemeClr val="phClr">
+                <a:shade val="63000"/>
+                <a:satMod val="120000"/>
+              </a:schemeClr>
+            </a:gs>
+          </a:gsLst>
+          <a:lin ang="5400000" scaled="0"/>
+        </a:gradFill>
+      </a:bgFillStyleLst>
+    </a:fmtScheme>
+  </a:themeElements>
+  <a:objectDefaults>
+    <a:lnDef>
+      <a:spPr/>
+      <a:bodyPr/>
+      <a:lstStyle/>
+      <a:style>
+        <a:lnRef idx="2">
+          <a:schemeClr val="accent1"/>
+        </a:lnRef>
+        <a:fillRef idx="0">
+          <a:schemeClr val="accent1"/>
+        </a:fillRef>
+        <a:effectRef idx="1">
+          <a:schemeClr val="accent1"/>
+        </a:effectRef>
+        <a:fontRef idx="minor">
+          <a:schemeClr val="tx1"/>
+        </a:fontRef>
+      </a:style>
+    </a:lnDef>
+  </a:objectDefaults>
+  <a:extraClrSchemeLst/>
+  <a:extLst>
+    <a:ext uri="{05A4C25C-085E-4340-85A3-A5531E510DB2}">
+      <thm15:themeFamily xmlns:thm15="http://schemas.microsoft.com/office/thememl/2012/main" name="Office Theme" id="{2E142A2C-CD16-42D6-873A-C26D2A0506FA}" vid="{1BDDFF52-6CD6-40A5-AB3C-68EB2F1E4D0A}"/>
+    </a:ext>
+  </a:extLst>
+</a:theme>
 </file>
</xml_diff>